<commit_message>
feat: 实现会议 zoom bot 入会
</commit_message>
<xml_diff>
--- a/专注的力量.docx
+++ b/专注的力量.docx
@@ -32,6 +32,14 @@
           <w:szCs w:val="36"/>
         </w:rPr>
       </w:r>
+      <w:r>
+        <w:rPr>
+          <w:rFonts w:ascii="Calibri" w:hAnsi="Calibri" w:eastAsia="微软雅黑"/>
+          <w:b/>
+          <w:sz w:val="36"/>
+          <w:szCs w:val="36"/>
+        </w:rPr>
+      </w:r>
     </w:p>
     <w:p>
       <w:pPr>
@@ -59,6 +67,13 @@
           <w:szCs w:val="24"/>
         </w:rPr>
       </w:r>
+      <w:r>
+        <w:rPr>
+          <w:rFonts w:ascii="Calibri" w:hAnsi="Calibri" w:eastAsia="微软雅黑"/>
+          <w:sz w:val="24"/>
+          <w:szCs w:val="24"/>
+        </w:rPr>
+      </w:r>
     </w:p>
     <w:p>
       <w:pPr>
@@ -86,10 +101,20 @@
           <w:szCs w:val="24"/>
         </w:rPr>
       </w:r>
+      <w:r>
+        <w:rPr>
+          <w:rFonts w:ascii="Calibri" w:hAnsi="Calibri" w:eastAsia="微软雅黑"/>
+          <w:sz w:val="24"/>
+          <w:szCs w:val="24"/>
+        </w:rPr>
+      </w:r>
     </w:p>
     <w:p>
       <w:pPr>
         <w:pBdr/>
+        <w:tabs>
+          <w:tab w:val="left" w:leader="none" w:pos="3783"/>
+        </w:tabs>
         <w:spacing w:after="120" w:line="360" w:lineRule="auto"/>
         <w:ind w:firstLine="480"/>
         <w:rPr>
@@ -112,6 +137,23 @@
           <w:rFonts w:ascii="Calibri" w:hAnsi="Calibri" w:eastAsia="微软雅黑"/>
           <w:sz w:val="24"/>
           <w:szCs w:val="24"/>
+        </w:rPr>
+      </w:r>
+      <w:r>
+        <w:rPr>
+          <w:rFonts w:ascii="Calibri" w:hAnsi="Calibri" w:eastAsia="微软雅黑"/>
+          <w:sz w:val="24"/>
+          <w:szCs w:val="24"/>
+          <w:highlight w:val="none"/>
+        </w:rPr>
+        <w:tab/>
+      </w:r>
+      <w:r>
+        <w:rPr>
+          <w:rFonts w:ascii="Calibri" w:hAnsi="Calibri" w:eastAsia="微软雅黑"/>
+          <w:sz w:val="24"/>
+          <w:szCs w:val="24"/>
+          <w:highlight w:val="none"/>
         </w:rPr>
       </w:r>
     </w:p>
@@ -181,15 +223,6 @@
           <w:rFonts w:ascii="Calibri" w:hAnsi="Calibri" w:eastAsia="微软雅黑"/>
           <w:sz w:val="24"/>
           <w:szCs w:val="24"/>
-          <w:highlight w:val="none"/>
-        </w:rPr>
-      </w:r>
-      <w:r>
-        <w:rPr>
-          <w:rFonts w:ascii="Calibri" w:hAnsi="Calibri" w:eastAsia="微软雅黑"/>
-          <w:sz w:val="24"/>
-          <w:szCs w:val="24"/>
-          <w:highlight w:val="none"/>
         </w:rPr>
       </w:r>
     </w:p>
@@ -215,7 +248,6 @@
         <w:ind/>
         <w:rPr/>
       </w:pPr>
-      <w:r/>
       <w:r>
         <w:separator/>
       </w:r>
@@ -230,7 +262,6 @@
         <w:ind/>
         <w:rPr/>
       </w:pPr>
-      <w:r/>
       <w:r>
         <w:continuationSeparator/>
       </w:r>
@@ -250,7 +281,6 @@
         <w:ind/>
         <w:rPr/>
       </w:pPr>
-      <w:r/>
       <w:r>
         <w:separator/>
       </w:r>
@@ -265,7 +295,6 @@
         <w:ind/>
         <w:rPr/>
       </w:pPr>
-      <w:r/>
       <w:r>
         <w:continuationSeparator/>
       </w:r>
@@ -420,7 +449,7 @@
     <w:lsdException w:name="Bibliography" w:uiPriority="37"/>
     <w:lsdException w:name="TOC Heading" w:uiPriority="39" w:qFormat="1"/>
   </w:latentStyles>
-  <w:style w:type="table" w:styleId="11" w:default="1">
+  <w:style w:type="table" w:styleId="701" w:default="1">
     <w:name w:val="Normal Table"/>
     <w:uiPriority w:val="99"/>
     <w:semiHidden/>
@@ -613,9 +642,9 @@
       </w:tcPr>
     </w:tblStylePr>
   </w:style>
-  <w:style w:type="table" w:styleId="12">
+  <w:style w:type="table" w:styleId="702">
     <w:name w:val="Table Grid"/>
-    <w:basedOn w:val="11"/>
+    <w:basedOn w:val="701"/>
     <w:uiPriority w:val="59"/>
     <w:pPr>
       <w:pBdr/>
@@ -812,9 +841,9 @@
       </w:tcPr>
     </w:tblStylePr>
   </w:style>
-  <w:style w:type="table" w:styleId="13">
+  <w:style w:type="table" w:styleId="703">
     <w:name w:val="Table Grid Light"/>
-    <w:basedOn w:val="11"/>
+    <w:basedOn w:val="701"/>
     <w:uiPriority w:val="59"/>
     <w:pPr>
       <w:pBdr/>
@@ -1011,9 +1040,9 @@
       </w:tcPr>
     </w:tblStylePr>
   </w:style>
-  <w:style w:type="table" w:styleId="14">
+  <w:style w:type="table" w:styleId="704">
     <w:name w:val="Plain Table 1"/>
-    <w:basedOn w:val="11"/>
+    <w:basedOn w:val="701"/>
     <w:uiPriority w:val="59"/>
     <w:pPr>
       <w:pBdr/>
@@ -1236,9 +1265,9 @@
       </w:tcPr>
     </w:tblStylePr>
   </w:style>
-  <w:style w:type="table" w:styleId="15">
+  <w:style w:type="table" w:styleId="705">
     <w:name w:val="Plain Table 2"/>
-    <w:basedOn w:val="11"/>
+    <w:basedOn w:val="701"/>
     <w:uiPriority w:val="59"/>
     <w:pPr>
       <w:pBdr/>
@@ -1469,9 +1498,9 @@
       </w:tcPr>
     </w:tblStylePr>
   </w:style>
-  <w:style w:type="table" w:styleId="16">
+  <w:style w:type="table" w:styleId="706">
     <w:name w:val="Plain Table 3"/>
-    <w:basedOn w:val="11"/>
+    <w:basedOn w:val="701"/>
     <w:uiPriority w:val="99"/>
     <w:pPr>
       <w:pBdr/>
@@ -1699,9 +1728,9 @@
       </w:tcPr>
     </w:tblStylePr>
   </w:style>
-  <w:style w:type="table" w:styleId="17">
+  <w:style w:type="table" w:styleId="707">
     <w:name w:val="Plain Table 4"/>
-    <w:basedOn w:val="11"/>
+    <w:basedOn w:val="701"/>
     <w:uiPriority w:val="99"/>
     <w:pPr>
       <w:pBdr/>
@@ -1915,9 +1944,9 @@
       </w:tcPr>
     </w:tblStylePr>
   </w:style>
-  <w:style w:type="table" w:styleId="18">
+  <w:style w:type="table" w:styleId="708">
     <w:name w:val="Plain Table 5"/>
-    <w:basedOn w:val="11"/>
+    <w:basedOn w:val="701"/>
     <w:uiPriority w:val="99"/>
     <w:pPr>
       <w:pBdr/>
@@ -2148,9 +2177,9 @@
       </w:tcPr>
     </w:tblStylePr>
   </w:style>
-  <w:style w:type="table" w:styleId="19">
+  <w:style w:type="table" w:styleId="709">
     <w:name w:val="Grid Table 1 Light"/>
-    <w:basedOn w:val="11"/>
+    <w:basedOn w:val="701"/>
     <w:uiPriority w:val="99"/>
     <w:pPr>
       <w:pBdr/>
@@ -2371,9 +2400,9 @@
       </w:tcPr>
     </w:tblStylePr>
   </w:style>
-  <w:style w:type="table" w:styleId="20">
+  <w:style w:type="table" w:styleId="710">
     <w:name w:val="Grid Table 1 Light - Accent 1"/>
-    <w:basedOn w:val="11"/>
+    <w:basedOn w:val="701"/>
     <w:uiPriority w:val="99"/>
     <w:pPr>
       <w:pBdr/>
@@ -2594,9 +2623,9 @@
       </w:tcPr>
     </w:tblStylePr>
   </w:style>
-  <w:style w:type="table" w:styleId="21">
+  <w:style w:type="table" w:styleId="711">
     <w:name w:val="Grid Table 1 Light - Accent 2"/>
-    <w:basedOn w:val="11"/>
+    <w:basedOn w:val="701"/>
     <w:uiPriority w:val="99"/>
     <w:pPr>
       <w:pBdr/>
@@ -2817,9 +2846,9 @@
       </w:tcPr>
     </w:tblStylePr>
   </w:style>
-  <w:style w:type="table" w:styleId="22">
+  <w:style w:type="table" w:styleId="712">
     <w:name w:val="Grid Table 1 Light - Accent 3"/>
-    <w:basedOn w:val="11"/>
+    <w:basedOn w:val="701"/>
     <w:uiPriority w:val="99"/>
     <w:pPr>
       <w:pBdr/>
@@ -3040,9 +3069,9 @@
       </w:tcPr>
     </w:tblStylePr>
   </w:style>
-  <w:style w:type="table" w:styleId="23">
+  <w:style w:type="table" w:styleId="713">
     <w:name w:val="Grid Table 1 Light - Accent 4"/>
-    <w:basedOn w:val="11"/>
+    <w:basedOn w:val="701"/>
     <w:uiPriority w:val="99"/>
     <w:pPr>
       <w:pBdr/>
@@ -3263,9 +3292,9 @@
       </w:tcPr>
     </w:tblStylePr>
   </w:style>
-  <w:style w:type="table" w:styleId="24">
+  <w:style w:type="table" w:styleId="714">
     <w:name w:val="Grid Table 1 Light - Accent 5"/>
-    <w:basedOn w:val="11"/>
+    <w:basedOn w:val="701"/>
     <w:uiPriority w:val="99"/>
     <w:pPr>
       <w:pBdr/>
@@ -3486,9 +3515,9 @@
       </w:tcPr>
     </w:tblStylePr>
   </w:style>
-  <w:style w:type="table" w:styleId="25">
+  <w:style w:type="table" w:styleId="715">
     <w:name w:val="Grid Table 1 Light - Accent 6"/>
-    <w:basedOn w:val="11"/>
+    <w:basedOn w:val="701"/>
     <w:uiPriority w:val="99"/>
     <w:pPr>
       <w:pBdr/>
@@ -3709,9 +3738,9 @@
       </w:tcPr>
     </w:tblStylePr>
   </w:style>
-  <w:style w:type="table" w:styleId="26">
+  <w:style w:type="table" w:styleId="716">
     <w:name w:val="Grid Table 2"/>
-    <w:basedOn w:val="11"/>
+    <w:basedOn w:val="701"/>
     <w:uiPriority w:val="99"/>
     <w:pPr>
       <w:pBdr/>
@@ -3941,9 +3970,9 @@
       </w:tcPr>
     </w:tblStylePr>
   </w:style>
-  <w:style w:type="table" w:styleId="27">
+  <w:style w:type="table" w:styleId="717">
     <w:name w:val="Grid Table 2 - Accent 1"/>
-    <w:basedOn w:val="11"/>
+    <w:basedOn w:val="701"/>
     <w:uiPriority w:val="99"/>
     <w:pPr>
       <w:pBdr/>
@@ -4173,9 +4202,9 @@
       </w:tcPr>
     </w:tblStylePr>
   </w:style>
-  <w:style w:type="table" w:styleId="28">
+  <w:style w:type="table" w:styleId="718">
     <w:name w:val="Grid Table 2 - Accent 2"/>
-    <w:basedOn w:val="11"/>
+    <w:basedOn w:val="701"/>
     <w:uiPriority w:val="99"/>
     <w:pPr>
       <w:pBdr/>
@@ -4405,9 +4434,9 @@
       </w:tcPr>
     </w:tblStylePr>
   </w:style>
-  <w:style w:type="table" w:styleId="29">
+  <w:style w:type="table" w:styleId="719">
     <w:name w:val="Grid Table 2 - Accent 3"/>
-    <w:basedOn w:val="11"/>
+    <w:basedOn w:val="701"/>
     <w:uiPriority w:val="99"/>
     <w:pPr>
       <w:pBdr/>
@@ -4637,9 +4666,9 @@
       </w:tcPr>
     </w:tblStylePr>
   </w:style>
-  <w:style w:type="table" w:styleId="30">
+  <w:style w:type="table" w:styleId="720">
     <w:name w:val="Grid Table 2 - Accent 4"/>
-    <w:basedOn w:val="11"/>
+    <w:basedOn w:val="701"/>
     <w:uiPriority w:val="99"/>
     <w:pPr>
       <w:pBdr/>
@@ -4869,9 +4898,9 @@
       </w:tcPr>
     </w:tblStylePr>
   </w:style>
-  <w:style w:type="table" w:styleId="31">
+  <w:style w:type="table" w:styleId="721">
     <w:name w:val="Grid Table 2 - Accent 5"/>
-    <w:basedOn w:val="11"/>
+    <w:basedOn w:val="701"/>
     <w:uiPriority w:val="99"/>
     <w:pPr>
       <w:pBdr/>
@@ -5101,9 +5130,9 @@
       </w:tcPr>
     </w:tblStylePr>
   </w:style>
-  <w:style w:type="table" w:styleId="32">
+  <w:style w:type="table" w:styleId="722">
     <w:name w:val="Grid Table 2 - Accent 6"/>
-    <w:basedOn w:val="11"/>
+    <w:basedOn w:val="701"/>
     <w:uiPriority w:val="99"/>
     <w:pPr>
       <w:pBdr/>
@@ -5333,9 +5362,9 @@
       </w:tcPr>
     </w:tblStylePr>
   </w:style>
-  <w:style w:type="table" w:styleId="33">
+  <w:style w:type="table" w:styleId="723">
     <w:name w:val="Grid Table 3"/>
-    <w:basedOn w:val="11"/>
+    <w:basedOn w:val="701"/>
     <w:uiPriority w:val="99"/>
     <w:pPr>
       <w:pBdr/>
@@ -5434,29 +5463,6 @@
         <w:tblBorders/>
       </w:tblPr>
       <w:tcPr>
-        <w:shd w:color="ffffff"/>
-        <w:tcBorders>
-          <w:top w:val="none" w:color="000000" w:sz="4" w:space="0"/>
-          <w:left w:val="none" w:color="000000" w:sz="4" w:space="0"/>
-          <w:bottom w:val="none" w:color="000000" w:sz="4" w:space="0"/>
-          <w:right w:val="none" w:color="000000" w:sz="4" w:space="0"/>
-        </w:tcBorders>
-      </w:tcPr>
-    </w:tblStylePr>
-    <w:tblStylePr w:type="firstRow">
-      <w:rPr>
-        <w:b/>
-        <w:color w:val="404040"/>
-      </w:rPr>
-      <w:pPr>
-        <w:pBdr/>
-        <w:spacing/>
-        <w:ind/>
-      </w:pPr>
-      <w:tblPr>
-        <w:tblBorders/>
-      </w:tblPr>
-      <w:tcPr>
         <w:shd w:val="clear" w:color="ffffff"/>
         <w:tcBorders>
           <w:top w:val="none" w:color="000000" w:sz="4" w:space="0"/>
@@ -5466,30 +5472,7 @@
         </w:tcBorders>
       </w:tcPr>
     </w:tblStylePr>
-    <w:tblStylePr w:type="lastCol">
-      <w:rPr>
-        <w:i/>
-        <w:color w:val="404040"/>
-      </w:rPr>
-      <w:pPr>
-        <w:pBdr/>
-        <w:spacing/>
-        <w:ind/>
-      </w:pPr>
-      <w:tblPr>
-        <w:tblBorders/>
-      </w:tblPr>
-      <w:tcPr>
-        <w:shd w:color="ffffff"/>
-        <w:tcBorders>
-          <w:top w:val="none" w:color="000000" w:sz="4" w:space="0"/>
-          <w:left w:val="none" w:color="000000" w:sz="4" w:space="0"/>
-          <w:bottom w:val="none" w:color="000000" w:sz="4" w:space="0"/>
-          <w:right w:val="none" w:color="000000" w:sz="4" w:space="0"/>
-        </w:tcBorders>
-      </w:tcPr>
-    </w:tblStylePr>
-    <w:tblStylePr w:type="lastRow">
+    <w:tblStylePr w:type="firstRow">
       <w:rPr>
         <w:b/>
         <w:color w:val="404040"/>
@@ -5512,6 +5495,52 @@
         </w:tcBorders>
       </w:tcPr>
     </w:tblStylePr>
+    <w:tblStylePr w:type="lastCol">
+      <w:rPr>
+        <w:i/>
+        <w:color w:val="404040"/>
+      </w:rPr>
+      <w:pPr>
+        <w:pBdr/>
+        <w:spacing/>
+        <w:ind/>
+      </w:pPr>
+      <w:tblPr>
+        <w:tblBorders/>
+      </w:tblPr>
+      <w:tcPr>
+        <w:shd w:val="clear" w:color="ffffff"/>
+        <w:tcBorders>
+          <w:top w:val="none" w:color="000000" w:sz="4" w:space="0"/>
+          <w:left w:val="none" w:color="000000" w:sz="4" w:space="0"/>
+          <w:bottom w:val="none" w:color="000000" w:sz="4" w:space="0"/>
+          <w:right w:val="none" w:color="000000" w:sz="4" w:space="0"/>
+        </w:tcBorders>
+      </w:tcPr>
+    </w:tblStylePr>
+    <w:tblStylePr w:type="lastRow">
+      <w:rPr>
+        <w:b/>
+        <w:color w:val="404040"/>
+      </w:rPr>
+      <w:pPr>
+        <w:pBdr/>
+        <w:spacing/>
+        <w:ind/>
+      </w:pPr>
+      <w:tblPr>
+        <w:tblBorders/>
+      </w:tblPr>
+      <w:tcPr>
+        <w:shd w:val="clear" w:color="ffffff"/>
+        <w:tcBorders>
+          <w:top w:val="none" w:color="000000" w:sz="4" w:space="0"/>
+          <w:left w:val="none" w:color="000000" w:sz="4" w:space="0"/>
+          <w:bottom w:val="none" w:color="000000" w:sz="4" w:space="0"/>
+          <w:right w:val="none" w:color="000000" w:sz="4" w:space="0"/>
+        </w:tcBorders>
+      </w:tcPr>
+    </w:tblStylePr>
     <w:tblStylePr w:type="nwCell">
       <w:pPr>
         <w:pBdr/>
@@ -5578,9 +5607,9 @@
       </w:tcPr>
     </w:tblStylePr>
   </w:style>
-  <w:style w:type="table" w:styleId="34">
+  <w:style w:type="table" w:styleId="724">
     <w:name w:val="Grid Table 3 - Accent 1"/>
-    <w:basedOn w:val="11"/>
+    <w:basedOn w:val="701"/>
     <w:uiPriority w:val="99"/>
     <w:pPr>
       <w:pBdr/>
@@ -5679,29 +5708,6 @@
         <w:tblBorders/>
       </w:tblPr>
       <w:tcPr>
-        <w:shd w:color="ffffff"/>
-        <w:tcBorders>
-          <w:top w:val="none" w:color="000000" w:sz="4" w:space="0"/>
-          <w:left w:val="none" w:color="000000" w:sz="4" w:space="0"/>
-          <w:bottom w:val="none" w:color="000000" w:sz="4" w:space="0"/>
-          <w:right w:val="none" w:color="000000" w:sz="4" w:space="0"/>
-        </w:tcBorders>
-      </w:tcPr>
-    </w:tblStylePr>
-    <w:tblStylePr w:type="firstRow">
-      <w:rPr>
-        <w:b/>
-        <w:color w:val="404040"/>
-      </w:rPr>
-      <w:pPr>
-        <w:pBdr/>
-        <w:spacing/>
-        <w:ind/>
-      </w:pPr>
-      <w:tblPr>
-        <w:tblBorders/>
-      </w:tblPr>
-      <w:tcPr>
         <w:shd w:val="clear" w:color="ffffff"/>
         <w:tcBorders>
           <w:top w:val="none" w:color="000000" w:sz="4" w:space="0"/>
@@ -5711,30 +5717,7 @@
         </w:tcBorders>
       </w:tcPr>
     </w:tblStylePr>
-    <w:tblStylePr w:type="lastCol">
-      <w:rPr>
-        <w:i/>
-        <w:color w:val="404040"/>
-      </w:rPr>
-      <w:pPr>
-        <w:pBdr/>
-        <w:spacing/>
-        <w:ind/>
-      </w:pPr>
-      <w:tblPr>
-        <w:tblBorders/>
-      </w:tblPr>
-      <w:tcPr>
-        <w:shd w:color="ffffff"/>
-        <w:tcBorders>
-          <w:top w:val="none" w:color="000000" w:sz="4" w:space="0"/>
-          <w:left w:val="none" w:color="000000" w:sz="4" w:space="0"/>
-          <w:bottom w:val="none" w:color="000000" w:sz="4" w:space="0"/>
-          <w:right w:val="none" w:color="000000" w:sz="4" w:space="0"/>
-        </w:tcBorders>
-      </w:tcPr>
-    </w:tblStylePr>
-    <w:tblStylePr w:type="lastRow">
+    <w:tblStylePr w:type="firstRow">
       <w:rPr>
         <w:b/>
         <w:color w:val="404040"/>
@@ -5757,6 +5740,52 @@
         </w:tcBorders>
       </w:tcPr>
     </w:tblStylePr>
+    <w:tblStylePr w:type="lastCol">
+      <w:rPr>
+        <w:i/>
+        <w:color w:val="404040"/>
+      </w:rPr>
+      <w:pPr>
+        <w:pBdr/>
+        <w:spacing/>
+        <w:ind/>
+      </w:pPr>
+      <w:tblPr>
+        <w:tblBorders/>
+      </w:tblPr>
+      <w:tcPr>
+        <w:shd w:val="clear" w:color="ffffff"/>
+        <w:tcBorders>
+          <w:top w:val="none" w:color="000000" w:sz="4" w:space="0"/>
+          <w:left w:val="none" w:color="000000" w:sz="4" w:space="0"/>
+          <w:bottom w:val="none" w:color="000000" w:sz="4" w:space="0"/>
+          <w:right w:val="none" w:color="000000" w:sz="4" w:space="0"/>
+        </w:tcBorders>
+      </w:tcPr>
+    </w:tblStylePr>
+    <w:tblStylePr w:type="lastRow">
+      <w:rPr>
+        <w:b/>
+        <w:color w:val="404040"/>
+      </w:rPr>
+      <w:pPr>
+        <w:pBdr/>
+        <w:spacing/>
+        <w:ind/>
+      </w:pPr>
+      <w:tblPr>
+        <w:tblBorders/>
+      </w:tblPr>
+      <w:tcPr>
+        <w:shd w:val="clear" w:color="ffffff"/>
+        <w:tcBorders>
+          <w:top w:val="none" w:color="000000" w:sz="4" w:space="0"/>
+          <w:left w:val="none" w:color="000000" w:sz="4" w:space="0"/>
+          <w:bottom w:val="none" w:color="000000" w:sz="4" w:space="0"/>
+          <w:right w:val="none" w:color="000000" w:sz="4" w:space="0"/>
+        </w:tcBorders>
+      </w:tcPr>
+    </w:tblStylePr>
     <w:tblStylePr w:type="nwCell">
       <w:pPr>
         <w:pBdr/>
@@ -5823,9 +5852,9 @@
       </w:tcPr>
     </w:tblStylePr>
   </w:style>
-  <w:style w:type="table" w:styleId="35">
+  <w:style w:type="table" w:styleId="725">
     <w:name w:val="Grid Table 3 - Accent 2"/>
-    <w:basedOn w:val="11"/>
+    <w:basedOn w:val="701"/>
     <w:uiPriority w:val="99"/>
     <w:pPr>
       <w:pBdr/>
@@ -5924,29 +5953,6 @@
         <w:tblBorders/>
       </w:tblPr>
       <w:tcPr>
-        <w:shd w:color="ffffff"/>
-        <w:tcBorders>
-          <w:top w:val="none" w:color="000000" w:sz="4" w:space="0"/>
-          <w:left w:val="none" w:color="000000" w:sz="4" w:space="0"/>
-          <w:bottom w:val="none" w:color="000000" w:sz="4" w:space="0"/>
-          <w:right w:val="none" w:color="000000" w:sz="4" w:space="0"/>
-        </w:tcBorders>
-      </w:tcPr>
-    </w:tblStylePr>
-    <w:tblStylePr w:type="firstRow">
-      <w:rPr>
-        <w:b/>
-        <w:color w:val="404040"/>
-      </w:rPr>
-      <w:pPr>
-        <w:pBdr/>
-        <w:spacing/>
-        <w:ind/>
-      </w:pPr>
-      <w:tblPr>
-        <w:tblBorders/>
-      </w:tblPr>
-      <w:tcPr>
         <w:shd w:val="clear" w:color="ffffff"/>
         <w:tcBorders>
           <w:top w:val="none" w:color="000000" w:sz="4" w:space="0"/>
@@ -5956,30 +5962,7 @@
         </w:tcBorders>
       </w:tcPr>
     </w:tblStylePr>
-    <w:tblStylePr w:type="lastCol">
-      <w:rPr>
-        <w:i/>
-        <w:color w:val="404040"/>
-      </w:rPr>
-      <w:pPr>
-        <w:pBdr/>
-        <w:spacing/>
-        <w:ind/>
-      </w:pPr>
-      <w:tblPr>
-        <w:tblBorders/>
-      </w:tblPr>
-      <w:tcPr>
-        <w:shd w:color="ffffff"/>
-        <w:tcBorders>
-          <w:top w:val="none" w:color="000000" w:sz="4" w:space="0"/>
-          <w:left w:val="none" w:color="000000" w:sz="4" w:space="0"/>
-          <w:bottom w:val="none" w:color="000000" w:sz="4" w:space="0"/>
-          <w:right w:val="none" w:color="000000" w:sz="4" w:space="0"/>
-        </w:tcBorders>
-      </w:tcPr>
-    </w:tblStylePr>
-    <w:tblStylePr w:type="lastRow">
+    <w:tblStylePr w:type="firstRow">
       <w:rPr>
         <w:b/>
         <w:color w:val="404040"/>
@@ -6002,6 +5985,52 @@
         </w:tcBorders>
       </w:tcPr>
     </w:tblStylePr>
+    <w:tblStylePr w:type="lastCol">
+      <w:rPr>
+        <w:i/>
+        <w:color w:val="404040"/>
+      </w:rPr>
+      <w:pPr>
+        <w:pBdr/>
+        <w:spacing/>
+        <w:ind/>
+      </w:pPr>
+      <w:tblPr>
+        <w:tblBorders/>
+      </w:tblPr>
+      <w:tcPr>
+        <w:shd w:val="clear" w:color="ffffff"/>
+        <w:tcBorders>
+          <w:top w:val="none" w:color="000000" w:sz="4" w:space="0"/>
+          <w:left w:val="none" w:color="000000" w:sz="4" w:space="0"/>
+          <w:bottom w:val="none" w:color="000000" w:sz="4" w:space="0"/>
+          <w:right w:val="none" w:color="000000" w:sz="4" w:space="0"/>
+        </w:tcBorders>
+      </w:tcPr>
+    </w:tblStylePr>
+    <w:tblStylePr w:type="lastRow">
+      <w:rPr>
+        <w:b/>
+        <w:color w:val="404040"/>
+      </w:rPr>
+      <w:pPr>
+        <w:pBdr/>
+        <w:spacing/>
+        <w:ind/>
+      </w:pPr>
+      <w:tblPr>
+        <w:tblBorders/>
+      </w:tblPr>
+      <w:tcPr>
+        <w:shd w:val="clear" w:color="ffffff"/>
+        <w:tcBorders>
+          <w:top w:val="none" w:color="000000" w:sz="4" w:space="0"/>
+          <w:left w:val="none" w:color="000000" w:sz="4" w:space="0"/>
+          <w:bottom w:val="none" w:color="000000" w:sz="4" w:space="0"/>
+          <w:right w:val="none" w:color="000000" w:sz="4" w:space="0"/>
+        </w:tcBorders>
+      </w:tcPr>
+    </w:tblStylePr>
     <w:tblStylePr w:type="nwCell">
       <w:pPr>
         <w:pBdr/>
@@ -6068,9 +6097,9 @@
       </w:tcPr>
     </w:tblStylePr>
   </w:style>
-  <w:style w:type="table" w:styleId="36">
+  <w:style w:type="table" w:styleId="726">
     <w:name w:val="Grid Table 3 - Accent 3"/>
-    <w:basedOn w:val="11"/>
+    <w:basedOn w:val="701"/>
     <w:uiPriority w:val="99"/>
     <w:pPr>
       <w:pBdr/>
@@ -6169,29 +6198,6 @@
         <w:tblBorders/>
       </w:tblPr>
       <w:tcPr>
-        <w:shd w:color="ffffff"/>
-        <w:tcBorders>
-          <w:top w:val="none" w:color="000000" w:sz="4" w:space="0"/>
-          <w:left w:val="none" w:color="000000" w:sz="4" w:space="0"/>
-          <w:bottom w:val="none" w:color="000000" w:sz="4" w:space="0"/>
-          <w:right w:val="none" w:color="000000" w:sz="4" w:space="0"/>
-        </w:tcBorders>
-      </w:tcPr>
-    </w:tblStylePr>
-    <w:tblStylePr w:type="firstRow">
-      <w:rPr>
-        <w:b/>
-        <w:color w:val="404040"/>
-      </w:rPr>
-      <w:pPr>
-        <w:pBdr/>
-        <w:spacing/>
-        <w:ind/>
-      </w:pPr>
-      <w:tblPr>
-        <w:tblBorders/>
-      </w:tblPr>
-      <w:tcPr>
         <w:shd w:val="clear" w:color="ffffff"/>
         <w:tcBorders>
           <w:top w:val="none" w:color="000000" w:sz="4" w:space="0"/>
@@ -6201,30 +6207,7 @@
         </w:tcBorders>
       </w:tcPr>
     </w:tblStylePr>
-    <w:tblStylePr w:type="lastCol">
-      <w:rPr>
-        <w:i/>
-        <w:color w:val="404040"/>
-      </w:rPr>
-      <w:pPr>
-        <w:pBdr/>
-        <w:spacing/>
-        <w:ind/>
-      </w:pPr>
-      <w:tblPr>
-        <w:tblBorders/>
-      </w:tblPr>
-      <w:tcPr>
-        <w:shd w:color="ffffff"/>
-        <w:tcBorders>
-          <w:top w:val="none" w:color="000000" w:sz="4" w:space="0"/>
-          <w:left w:val="none" w:color="000000" w:sz="4" w:space="0"/>
-          <w:bottom w:val="none" w:color="000000" w:sz="4" w:space="0"/>
-          <w:right w:val="none" w:color="000000" w:sz="4" w:space="0"/>
-        </w:tcBorders>
-      </w:tcPr>
-    </w:tblStylePr>
-    <w:tblStylePr w:type="lastRow">
+    <w:tblStylePr w:type="firstRow">
       <w:rPr>
         <w:b/>
         <w:color w:val="404040"/>
@@ -6247,6 +6230,52 @@
         </w:tcBorders>
       </w:tcPr>
     </w:tblStylePr>
+    <w:tblStylePr w:type="lastCol">
+      <w:rPr>
+        <w:i/>
+        <w:color w:val="404040"/>
+      </w:rPr>
+      <w:pPr>
+        <w:pBdr/>
+        <w:spacing/>
+        <w:ind/>
+      </w:pPr>
+      <w:tblPr>
+        <w:tblBorders/>
+      </w:tblPr>
+      <w:tcPr>
+        <w:shd w:val="clear" w:color="ffffff"/>
+        <w:tcBorders>
+          <w:top w:val="none" w:color="000000" w:sz="4" w:space="0"/>
+          <w:left w:val="none" w:color="000000" w:sz="4" w:space="0"/>
+          <w:bottom w:val="none" w:color="000000" w:sz="4" w:space="0"/>
+          <w:right w:val="none" w:color="000000" w:sz="4" w:space="0"/>
+        </w:tcBorders>
+      </w:tcPr>
+    </w:tblStylePr>
+    <w:tblStylePr w:type="lastRow">
+      <w:rPr>
+        <w:b/>
+        <w:color w:val="404040"/>
+      </w:rPr>
+      <w:pPr>
+        <w:pBdr/>
+        <w:spacing/>
+        <w:ind/>
+      </w:pPr>
+      <w:tblPr>
+        <w:tblBorders/>
+      </w:tblPr>
+      <w:tcPr>
+        <w:shd w:val="clear" w:color="ffffff"/>
+        <w:tcBorders>
+          <w:top w:val="none" w:color="000000" w:sz="4" w:space="0"/>
+          <w:left w:val="none" w:color="000000" w:sz="4" w:space="0"/>
+          <w:bottom w:val="none" w:color="000000" w:sz="4" w:space="0"/>
+          <w:right w:val="none" w:color="000000" w:sz="4" w:space="0"/>
+        </w:tcBorders>
+      </w:tcPr>
+    </w:tblStylePr>
     <w:tblStylePr w:type="nwCell">
       <w:pPr>
         <w:pBdr/>
@@ -6313,9 +6342,9 @@
       </w:tcPr>
     </w:tblStylePr>
   </w:style>
-  <w:style w:type="table" w:styleId="37">
+  <w:style w:type="table" w:styleId="727">
     <w:name w:val="Grid Table 3 - Accent 4"/>
-    <w:basedOn w:val="11"/>
+    <w:basedOn w:val="701"/>
     <w:uiPriority w:val="99"/>
     <w:pPr>
       <w:pBdr/>
@@ -6414,29 +6443,6 @@
         <w:tblBorders/>
       </w:tblPr>
       <w:tcPr>
-        <w:shd w:color="ffffff"/>
-        <w:tcBorders>
-          <w:top w:val="none" w:color="000000" w:sz="4" w:space="0"/>
-          <w:left w:val="none" w:color="000000" w:sz="4" w:space="0"/>
-          <w:bottom w:val="none" w:color="000000" w:sz="4" w:space="0"/>
-          <w:right w:val="none" w:color="000000" w:sz="4" w:space="0"/>
-        </w:tcBorders>
-      </w:tcPr>
-    </w:tblStylePr>
-    <w:tblStylePr w:type="firstRow">
-      <w:rPr>
-        <w:b/>
-        <w:color w:val="404040"/>
-      </w:rPr>
-      <w:pPr>
-        <w:pBdr/>
-        <w:spacing/>
-        <w:ind/>
-      </w:pPr>
-      <w:tblPr>
-        <w:tblBorders/>
-      </w:tblPr>
-      <w:tcPr>
         <w:shd w:val="clear" w:color="ffffff"/>
         <w:tcBorders>
           <w:top w:val="none" w:color="000000" w:sz="4" w:space="0"/>
@@ -6446,30 +6452,7 @@
         </w:tcBorders>
       </w:tcPr>
     </w:tblStylePr>
-    <w:tblStylePr w:type="lastCol">
-      <w:rPr>
-        <w:i/>
-        <w:color w:val="404040"/>
-      </w:rPr>
-      <w:pPr>
-        <w:pBdr/>
-        <w:spacing/>
-        <w:ind/>
-      </w:pPr>
-      <w:tblPr>
-        <w:tblBorders/>
-      </w:tblPr>
-      <w:tcPr>
-        <w:shd w:color="ffffff"/>
-        <w:tcBorders>
-          <w:top w:val="none" w:color="000000" w:sz="4" w:space="0"/>
-          <w:left w:val="none" w:color="000000" w:sz="4" w:space="0"/>
-          <w:bottom w:val="none" w:color="000000" w:sz="4" w:space="0"/>
-          <w:right w:val="none" w:color="000000" w:sz="4" w:space="0"/>
-        </w:tcBorders>
-      </w:tcPr>
-    </w:tblStylePr>
-    <w:tblStylePr w:type="lastRow">
+    <w:tblStylePr w:type="firstRow">
       <w:rPr>
         <w:b/>
         <w:color w:val="404040"/>
@@ -6492,6 +6475,52 @@
         </w:tcBorders>
       </w:tcPr>
     </w:tblStylePr>
+    <w:tblStylePr w:type="lastCol">
+      <w:rPr>
+        <w:i/>
+        <w:color w:val="404040"/>
+      </w:rPr>
+      <w:pPr>
+        <w:pBdr/>
+        <w:spacing/>
+        <w:ind/>
+      </w:pPr>
+      <w:tblPr>
+        <w:tblBorders/>
+      </w:tblPr>
+      <w:tcPr>
+        <w:shd w:val="clear" w:color="ffffff"/>
+        <w:tcBorders>
+          <w:top w:val="none" w:color="000000" w:sz="4" w:space="0"/>
+          <w:left w:val="none" w:color="000000" w:sz="4" w:space="0"/>
+          <w:bottom w:val="none" w:color="000000" w:sz="4" w:space="0"/>
+          <w:right w:val="none" w:color="000000" w:sz="4" w:space="0"/>
+        </w:tcBorders>
+      </w:tcPr>
+    </w:tblStylePr>
+    <w:tblStylePr w:type="lastRow">
+      <w:rPr>
+        <w:b/>
+        <w:color w:val="404040"/>
+      </w:rPr>
+      <w:pPr>
+        <w:pBdr/>
+        <w:spacing/>
+        <w:ind/>
+      </w:pPr>
+      <w:tblPr>
+        <w:tblBorders/>
+      </w:tblPr>
+      <w:tcPr>
+        <w:shd w:val="clear" w:color="ffffff"/>
+        <w:tcBorders>
+          <w:top w:val="none" w:color="000000" w:sz="4" w:space="0"/>
+          <w:left w:val="none" w:color="000000" w:sz="4" w:space="0"/>
+          <w:bottom w:val="none" w:color="000000" w:sz="4" w:space="0"/>
+          <w:right w:val="none" w:color="000000" w:sz="4" w:space="0"/>
+        </w:tcBorders>
+      </w:tcPr>
+    </w:tblStylePr>
     <w:tblStylePr w:type="nwCell">
       <w:pPr>
         <w:pBdr/>
@@ -6558,9 +6587,9 @@
       </w:tcPr>
     </w:tblStylePr>
   </w:style>
-  <w:style w:type="table" w:styleId="38">
+  <w:style w:type="table" w:styleId="728">
     <w:name w:val="Grid Table 3 - Accent 5"/>
-    <w:basedOn w:val="11"/>
+    <w:basedOn w:val="701"/>
     <w:uiPriority w:val="99"/>
     <w:pPr>
       <w:pBdr/>
@@ -6659,29 +6688,6 @@
         <w:tblBorders/>
       </w:tblPr>
       <w:tcPr>
-        <w:shd w:color="ffffff"/>
-        <w:tcBorders>
-          <w:top w:val="none" w:color="000000" w:sz="4" w:space="0"/>
-          <w:left w:val="none" w:color="000000" w:sz="4" w:space="0"/>
-          <w:bottom w:val="none" w:color="000000" w:sz="4" w:space="0"/>
-          <w:right w:val="none" w:color="000000" w:sz="4" w:space="0"/>
-        </w:tcBorders>
-      </w:tcPr>
-    </w:tblStylePr>
-    <w:tblStylePr w:type="firstRow">
-      <w:rPr>
-        <w:b/>
-        <w:color w:val="404040"/>
-      </w:rPr>
-      <w:pPr>
-        <w:pBdr/>
-        <w:spacing/>
-        <w:ind/>
-      </w:pPr>
-      <w:tblPr>
-        <w:tblBorders/>
-      </w:tblPr>
-      <w:tcPr>
         <w:shd w:val="clear" w:color="ffffff"/>
         <w:tcBorders>
           <w:top w:val="none" w:color="000000" w:sz="4" w:space="0"/>
@@ -6691,30 +6697,7 @@
         </w:tcBorders>
       </w:tcPr>
     </w:tblStylePr>
-    <w:tblStylePr w:type="lastCol">
-      <w:rPr>
-        <w:i/>
-        <w:color w:val="404040"/>
-      </w:rPr>
-      <w:pPr>
-        <w:pBdr/>
-        <w:spacing/>
-        <w:ind/>
-      </w:pPr>
-      <w:tblPr>
-        <w:tblBorders/>
-      </w:tblPr>
-      <w:tcPr>
-        <w:shd w:color="ffffff"/>
-        <w:tcBorders>
-          <w:top w:val="none" w:color="000000" w:sz="4" w:space="0"/>
-          <w:left w:val="none" w:color="000000" w:sz="4" w:space="0"/>
-          <w:bottom w:val="none" w:color="000000" w:sz="4" w:space="0"/>
-          <w:right w:val="none" w:color="000000" w:sz="4" w:space="0"/>
-        </w:tcBorders>
-      </w:tcPr>
-    </w:tblStylePr>
-    <w:tblStylePr w:type="lastRow">
+    <w:tblStylePr w:type="firstRow">
       <w:rPr>
         <w:b/>
         <w:color w:val="404040"/>
@@ -6737,6 +6720,52 @@
         </w:tcBorders>
       </w:tcPr>
     </w:tblStylePr>
+    <w:tblStylePr w:type="lastCol">
+      <w:rPr>
+        <w:i/>
+        <w:color w:val="404040"/>
+      </w:rPr>
+      <w:pPr>
+        <w:pBdr/>
+        <w:spacing/>
+        <w:ind/>
+      </w:pPr>
+      <w:tblPr>
+        <w:tblBorders/>
+      </w:tblPr>
+      <w:tcPr>
+        <w:shd w:val="clear" w:color="ffffff"/>
+        <w:tcBorders>
+          <w:top w:val="none" w:color="000000" w:sz="4" w:space="0"/>
+          <w:left w:val="none" w:color="000000" w:sz="4" w:space="0"/>
+          <w:bottom w:val="none" w:color="000000" w:sz="4" w:space="0"/>
+          <w:right w:val="none" w:color="000000" w:sz="4" w:space="0"/>
+        </w:tcBorders>
+      </w:tcPr>
+    </w:tblStylePr>
+    <w:tblStylePr w:type="lastRow">
+      <w:rPr>
+        <w:b/>
+        <w:color w:val="404040"/>
+      </w:rPr>
+      <w:pPr>
+        <w:pBdr/>
+        <w:spacing/>
+        <w:ind/>
+      </w:pPr>
+      <w:tblPr>
+        <w:tblBorders/>
+      </w:tblPr>
+      <w:tcPr>
+        <w:shd w:val="clear" w:color="ffffff"/>
+        <w:tcBorders>
+          <w:top w:val="none" w:color="000000" w:sz="4" w:space="0"/>
+          <w:left w:val="none" w:color="000000" w:sz="4" w:space="0"/>
+          <w:bottom w:val="none" w:color="000000" w:sz="4" w:space="0"/>
+          <w:right w:val="none" w:color="000000" w:sz="4" w:space="0"/>
+        </w:tcBorders>
+      </w:tcPr>
+    </w:tblStylePr>
     <w:tblStylePr w:type="nwCell">
       <w:pPr>
         <w:pBdr/>
@@ -6803,9 +6832,9 @@
       </w:tcPr>
     </w:tblStylePr>
   </w:style>
-  <w:style w:type="table" w:styleId="39">
+  <w:style w:type="table" w:styleId="729">
     <w:name w:val="Grid Table 3 - Accent 6"/>
-    <w:basedOn w:val="11"/>
+    <w:basedOn w:val="701"/>
     <w:uiPriority w:val="99"/>
     <w:pPr>
       <w:pBdr/>
@@ -6904,29 +6933,6 @@
         <w:tblBorders/>
       </w:tblPr>
       <w:tcPr>
-        <w:shd w:color="ffffff"/>
-        <w:tcBorders>
-          <w:top w:val="none" w:color="000000" w:sz="4" w:space="0"/>
-          <w:left w:val="none" w:color="000000" w:sz="4" w:space="0"/>
-          <w:bottom w:val="none" w:color="000000" w:sz="4" w:space="0"/>
-          <w:right w:val="none" w:color="000000" w:sz="4" w:space="0"/>
-        </w:tcBorders>
-      </w:tcPr>
-    </w:tblStylePr>
-    <w:tblStylePr w:type="firstRow">
-      <w:rPr>
-        <w:b/>
-        <w:color w:val="404040"/>
-      </w:rPr>
-      <w:pPr>
-        <w:pBdr/>
-        <w:spacing/>
-        <w:ind/>
-      </w:pPr>
-      <w:tblPr>
-        <w:tblBorders/>
-      </w:tblPr>
-      <w:tcPr>
         <w:shd w:val="clear" w:color="ffffff"/>
         <w:tcBorders>
           <w:top w:val="none" w:color="000000" w:sz="4" w:space="0"/>
@@ -6936,30 +6942,7 @@
         </w:tcBorders>
       </w:tcPr>
     </w:tblStylePr>
-    <w:tblStylePr w:type="lastCol">
-      <w:rPr>
-        <w:i/>
-        <w:color w:val="404040"/>
-      </w:rPr>
-      <w:pPr>
-        <w:pBdr/>
-        <w:spacing/>
-        <w:ind/>
-      </w:pPr>
-      <w:tblPr>
-        <w:tblBorders/>
-      </w:tblPr>
-      <w:tcPr>
-        <w:shd w:color="ffffff"/>
-        <w:tcBorders>
-          <w:top w:val="none" w:color="000000" w:sz="4" w:space="0"/>
-          <w:left w:val="none" w:color="000000" w:sz="4" w:space="0"/>
-          <w:bottom w:val="none" w:color="000000" w:sz="4" w:space="0"/>
-          <w:right w:val="none" w:color="000000" w:sz="4" w:space="0"/>
-        </w:tcBorders>
-      </w:tcPr>
-    </w:tblStylePr>
-    <w:tblStylePr w:type="lastRow">
+    <w:tblStylePr w:type="firstRow">
       <w:rPr>
         <w:b/>
         <w:color w:val="404040"/>
@@ -6982,6 +6965,52 @@
         </w:tcBorders>
       </w:tcPr>
     </w:tblStylePr>
+    <w:tblStylePr w:type="lastCol">
+      <w:rPr>
+        <w:i/>
+        <w:color w:val="404040"/>
+      </w:rPr>
+      <w:pPr>
+        <w:pBdr/>
+        <w:spacing/>
+        <w:ind/>
+      </w:pPr>
+      <w:tblPr>
+        <w:tblBorders/>
+      </w:tblPr>
+      <w:tcPr>
+        <w:shd w:val="clear" w:color="ffffff"/>
+        <w:tcBorders>
+          <w:top w:val="none" w:color="000000" w:sz="4" w:space="0"/>
+          <w:left w:val="none" w:color="000000" w:sz="4" w:space="0"/>
+          <w:bottom w:val="none" w:color="000000" w:sz="4" w:space="0"/>
+          <w:right w:val="none" w:color="000000" w:sz="4" w:space="0"/>
+        </w:tcBorders>
+      </w:tcPr>
+    </w:tblStylePr>
+    <w:tblStylePr w:type="lastRow">
+      <w:rPr>
+        <w:b/>
+        <w:color w:val="404040"/>
+      </w:rPr>
+      <w:pPr>
+        <w:pBdr/>
+        <w:spacing/>
+        <w:ind/>
+      </w:pPr>
+      <w:tblPr>
+        <w:tblBorders/>
+      </w:tblPr>
+      <w:tcPr>
+        <w:shd w:val="clear" w:color="ffffff"/>
+        <w:tcBorders>
+          <w:top w:val="none" w:color="000000" w:sz="4" w:space="0"/>
+          <w:left w:val="none" w:color="000000" w:sz="4" w:space="0"/>
+          <w:bottom w:val="none" w:color="000000" w:sz="4" w:space="0"/>
+          <w:right w:val="none" w:color="000000" w:sz="4" w:space="0"/>
+        </w:tcBorders>
+      </w:tcPr>
+    </w:tblStylePr>
     <w:tblStylePr w:type="nwCell">
       <w:pPr>
         <w:pBdr/>
@@ -7048,9 +7077,9 @@
       </w:tcPr>
     </w:tblStylePr>
   </w:style>
-  <w:style w:type="table" w:styleId="40">
+  <w:style w:type="table" w:styleId="730">
     <w:name w:val="Grid Table 4"/>
-    <w:basedOn w:val="11"/>
+    <w:basedOn w:val="701"/>
     <w:uiPriority w:val="59"/>
     <w:pPr>
       <w:pBdr/>
@@ -7281,9 +7310,9 @@
       </w:tcPr>
     </w:tblStylePr>
   </w:style>
-  <w:style w:type="table" w:styleId="41">
+  <w:style w:type="table" w:styleId="731">
     <w:name w:val="Grid Table 4 - Accent 1"/>
-    <w:basedOn w:val="11"/>
+    <w:basedOn w:val="701"/>
     <w:uiPriority w:val="59"/>
     <w:pPr>
       <w:pBdr/>
@@ -7514,9 +7543,9 @@
       </w:tcPr>
     </w:tblStylePr>
   </w:style>
-  <w:style w:type="table" w:styleId="42">
+  <w:style w:type="table" w:styleId="732">
     <w:name w:val="Grid Table 4 - Accent 2"/>
-    <w:basedOn w:val="11"/>
+    <w:basedOn w:val="701"/>
     <w:uiPriority w:val="59"/>
     <w:pPr>
       <w:pBdr/>
@@ -7747,9 +7776,9 @@
       </w:tcPr>
     </w:tblStylePr>
   </w:style>
-  <w:style w:type="table" w:styleId="43">
+  <w:style w:type="table" w:styleId="733">
     <w:name w:val="Grid Table 4 - Accent 3"/>
-    <w:basedOn w:val="11"/>
+    <w:basedOn w:val="701"/>
     <w:uiPriority w:val="59"/>
     <w:pPr>
       <w:pBdr/>
@@ -7980,9 +8009,9 @@
       </w:tcPr>
     </w:tblStylePr>
   </w:style>
-  <w:style w:type="table" w:styleId="44">
+  <w:style w:type="table" w:styleId="734">
     <w:name w:val="Grid Table 4 - Accent 4"/>
-    <w:basedOn w:val="11"/>
+    <w:basedOn w:val="701"/>
     <w:uiPriority w:val="59"/>
     <w:pPr>
       <w:pBdr/>
@@ -8213,9 +8242,9 @@
       </w:tcPr>
     </w:tblStylePr>
   </w:style>
-  <w:style w:type="table" w:styleId="45">
+  <w:style w:type="table" w:styleId="735">
     <w:name w:val="Grid Table 4 - Accent 5"/>
-    <w:basedOn w:val="11"/>
+    <w:basedOn w:val="701"/>
     <w:uiPriority w:val="59"/>
     <w:pPr>
       <w:pBdr/>
@@ -8446,9 +8475,9 @@
       </w:tcPr>
     </w:tblStylePr>
   </w:style>
-  <w:style w:type="table" w:styleId="46">
+  <w:style w:type="table" w:styleId="736">
     <w:name w:val="Grid Table 4 - Accent 6"/>
-    <w:basedOn w:val="11"/>
+    <w:basedOn w:val="701"/>
     <w:uiPriority w:val="59"/>
     <w:pPr>
       <w:pBdr/>
@@ -8679,9 +8708,9 @@
       </w:tcPr>
     </w:tblStylePr>
   </w:style>
-  <w:style w:type="table" w:styleId="47">
+  <w:style w:type="table" w:styleId="737">
     <w:name w:val="Grid Table 5 Dark"/>
-    <w:basedOn w:val="11"/>
+    <w:basedOn w:val="701"/>
     <w:uiPriority w:val="99"/>
     <w:pPr>
       <w:pBdr/>
@@ -8907,9 +8936,9 @@
       </w:tcPr>
     </w:tblStylePr>
   </w:style>
-  <w:style w:type="table" w:styleId="48">
+  <w:style w:type="table" w:styleId="738">
     <w:name w:val="Grid Table 5 Dark- Accent 1"/>
-    <w:basedOn w:val="11"/>
+    <w:basedOn w:val="701"/>
     <w:uiPriority w:val="99"/>
     <w:pPr>
       <w:pBdr/>
@@ -9135,9 +9164,9 @@
       </w:tcPr>
     </w:tblStylePr>
   </w:style>
-  <w:style w:type="table" w:styleId="49">
+  <w:style w:type="table" w:styleId="739">
     <w:name w:val="Grid Table 5 Dark - Accent 2"/>
-    <w:basedOn w:val="11"/>
+    <w:basedOn w:val="701"/>
     <w:uiPriority w:val="99"/>
     <w:pPr>
       <w:pBdr/>
@@ -9363,9 +9392,9 @@
       </w:tcPr>
     </w:tblStylePr>
   </w:style>
-  <w:style w:type="table" w:styleId="50">
+  <w:style w:type="table" w:styleId="740">
     <w:name w:val="Grid Table 5 Dark - Accent 3"/>
-    <w:basedOn w:val="11"/>
+    <w:basedOn w:val="701"/>
     <w:uiPriority w:val="99"/>
     <w:pPr>
       <w:pBdr/>
@@ -9591,9 +9620,9 @@
       </w:tcPr>
     </w:tblStylePr>
   </w:style>
-  <w:style w:type="table" w:styleId="51">
+  <w:style w:type="table" w:styleId="741">
     <w:name w:val="Grid Table 5 Dark- Accent 4"/>
-    <w:basedOn w:val="11"/>
+    <w:basedOn w:val="701"/>
     <w:uiPriority w:val="99"/>
     <w:pPr>
       <w:pBdr/>
@@ -9819,9 +9848,9 @@
       </w:tcPr>
     </w:tblStylePr>
   </w:style>
-  <w:style w:type="table" w:styleId="52">
+  <w:style w:type="table" w:styleId="742">
     <w:name w:val="Grid Table 5 Dark - Accent 5"/>
-    <w:basedOn w:val="11"/>
+    <w:basedOn w:val="701"/>
     <w:uiPriority w:val="99"/>
     <w:pPr>
       <w:pBdr/>
@@ -10047,9 +10076,9 @@
       </w:tcPr>
     </w:tblStylePr>
   </w:style>
-  <w:style w:type="table" w:styleId="53">
+  <w:style w:type="table" w:styleId="743">
     <w:name w:val="Grid Table 5 Dark - Accent 6"/>
-    <w:basedOn w:val="11"/>
+    <w:basedOn w:val="701"/>
     <w:uiPriority w:val="99"/>
     <w:pPr>
       <w:pBdr/>
@@ -10275,9 +10304,9 @@
       </w:tcPr>
     </w:tblStylePr>
   </w:style>
-  <w:style w:type="table" w:styleId="54">
+  <w:style w:type="table" w:styleId="744">
     <w:name w:val="Grid Table 6 Colorful"/>
-    <w:basedOn w:val="11"/>
+    <w:basedOn w:val="701"/>
     <w:uiPriority w:val="99"/>
     <w:pPr>
       <w:pBdr/>
@@ -10505,9 +10534,9 @@
       </w:tcPr>
     </w:tblStylePr>
   </w:style>
-  <w:style w:type="table" w:styleId="55">
+  <w:style w:type="table" w:styleId="745">
     <w:name w:val="Grid Table 6 Colorful - Accent 1"/>
-    <w:basedOn w:val="11"/>
+    <w:basedOn w:val="701"/>
     <w:uiPriority w:val="99"/>
     <w:pPr>
       <w:pBdr/>
@@ -10735,9 +10764,9 @@
       </w:tcPr>
     </w:tblStylePr>
   </w:style>
-  <w:style w:type="table" w:styleId="56">
+  <w:style w:type="table" w:styleId="746">
     <w:name w:val="Grid Table 6 Colorful - Accent 2"/>
-    <w:basedOn w:val="11"/>
+    <w:basedOn w:val="701"/>
     <w:uiPriority w:val="99"/>
     <w:pPr>
       <w:pBdr/>
@@ -10965,9 +10994,9 @@
       </w:tcPr>
     </w:tblStylePr>
   </w:style>
-  <w:style w:type="table" w:styleId="57">
+  <w:style w:type="table" w:styleId="747">
     <w:name w:val="Grid Table 6 Colorful - Accent 3"/>
-    <w:basedOn w:val="11"/>
+    <w:basedOn w:val="701"/>
     <w:uiPriority w:val="99"/>
     <w:pPr>
       <w:pBdr/>
@@ -11195,9 +11224,9 @@
       </w:tcPr>
     </w:tblStylePr>
   </w:style>
-  <w:style w:type="table" w:styleId="58">
+  <w:style w:type="table" w:styleId="748">
     <w:name w:val="Grid Table 6 Colorful - Accent 4"/>
-    <w:basedOn w:val="11"/>
+    <w:basedOn w:val="701"/>
     <w:uiPriority w:val="99"/>
     <w:pPr>
       <w:pBdr/>
@@ -11425,9 +11454,9 @@
       </w:tcPr>
     </w:tblStylePr>
   </w:style>
-  <w:style w:type="table" w:styleId="59">
+  <w:style w:type="table" w:styleId="749">
     <w:name w:val="Grid Table 6 Colorful - Accent 5"/>
-    <w:basedOn w:val="11"/>
+    <w:basedOn w:val="701"/>
     <w:uiPriority w:val="99"/>
     <w:pPr>
       <w:pBdr/>
@@ -11655,9 +11684,9 @@
       </w:tcPr>
     </w:tblStylePr>
   </w:style>
-  <w:style w:type="table" w:styleId="60">
+  <w:style w:type="table" w:styleId="750">
     <w:name w:val="Grid Table 6 Colorful - Accent 6"/>
-    <w:basedOn w:val="11"/>
+    <w:basedOn w:val="701"/>
     <w:uiPriority w:val="99"/>
     <w:pPr>
       <w:pBdr/>
@@ -11885,9 +11914,9 @@
       </w:tcPr>
     </w:tblStylePr>
   </w:style>
-  <w:style w:type="table" w:styleId="61">
+  <w:style w:type="table" w:styleId="751">
     <w:name w:val="Grid Table 7 Colorful"/>
-    <w:basedOn w:val="11"/>
+    <w:basedOn w:val="701"/>
     <w:uiPriority w:val="99"/>
     <w:pPr>
       <w:pBdr/>
@@ -11989,11 +12018,11 @@
         <w:tblBorders/>
       </w:tblPr>
       <w:tcPr>
-        <w:shd w:color="ffffff"/>
+        <w:shd w:val="clear" w:color="ffffff"/>
         <w:tcBorders>
-          <w:top w:val="none"/>
-          <w:left w:val="none"/>
-          <w:bottom w:val="none"/>
+          <w:top w:val="none" w:color="000000" w:sz="4" w:space="0"/>
+          <w:left w:val="none" w:color="000000" w:sz="4" w:space="0"/>
+          <w:bottom w:val="none" w:color="000000" w:sz="4" w:space="0"/>
           <w:right w:val="single" w:color="000000" w:themeColor="text1" w:themeTint="80" w:sz="4" w:space="0"/>
         </w:tcBorders>
       </w:tcPr>
@@ -12016,10 +12045,10 @@
       <w:tcPr>
         <w:shd w:val="clear" w:color="ffffff" w:themeColor="light1" w:fill="ffffff" w:themeFill="light1"/>
         <w:tcBorders>
-          <w:top w:val="none"/>
-          <w:left w:val="none"/>
+          <w:top w:val="none" w:color="000000" w:sz="4" w:space="0"/>
+          <w:left w:val="none" w:color="000000" w:sz="4" w:space="0"/>
           <w:bottom w:val="single" w:color="000000" w:themeColor="text1" w:themeTint="80" w:sz="4" w:space="0"/>
-          <w:right w:val="none"/>
+          <w:right w:val="none" w:color="000000" w:sz="4" w:space="0"/>
         </w:tcBorders>
       </w:tcPr>
     </w:tblStylePr>
@@ -12039,12 +12068,12 @@
         <w:tblBorders/>
       </w:tblPr>
       <w:tcPr>
-        <w:shd w:color="ffffff"/>
+        <w:shd w:val="clear" w:color="ffffff"/>
         <w:tcBorders>
-          <w:top w:val="none"/>
+          <w:top w:val="none" w:color="000000" w:sz="4" w:space="0"/>
           <w:left w:val="single" w:color="000000" w:themeColor="text1" w:themeTint="80" w:sz="4" w:space="0"/>
-          <w:bottom w:val="none"/>
-          <w:right w:val="none"/>
+          <w:bottom w:val="none" w:color="000000" w:sz="4" w:space="0"/>
+          <w:right w:val="none" w:color="000000" w:sz="4" w:space="0"/>
         </w:tcBorders>
       </w:tcPr>
     </w:tblStylePr>
@@ -12067,9 +12096,9 @@
         <w:shd w:val="clear" w:color="ffffff" w:themeColor="light1" w:fill="ffffff" w:themeFill="light1"/>
         <w:tcBorders>
           <w:top w:val="single" w:color="000000" w:themeColor="text1" w:themeTint="80" w:sz="4" w:space="0"/>
-          <w:left w:val="none"/>
-          <w:bottom w:val="none"/>
-          <w:right w:val="none"/>
+          <w:left w:val="none" w:color="000000" w:sz="4" w:space="0"/>
+          <w:bottom w:val="none" w:color="000000" w:sz="4" w:space="0"/>
+          <w:right w:val="none" w:color="000000" w:sz="4" w:space="0"/>
         </w:tcBorders>
       </w:tcPr>
     </w:tblStylePr>
@@ -12139,9 +12168,9 @@
       </w:tcPr>
     </w:tblStylePr>
   </w:style>
-  <w:style w:type="table" w:styleId="62">
+  <w:style w:type="table" w:styleId="752">
     <w:name w:val="Grid Table 7 Colorful - Accent 1"/>
-    <w:basedOn w:val="11"/>
+    <w:basedOn w:val="701"/>
     <w:uiPriority w:val="99"/>
     <w:pPr>
       <w:pBdr/>
@@ -12243,11 +12272,11 @@
         <w:tblBorders/>
       </w:tblPr>
       <w:tcPr>
-        <w:shd w:color="ffffff"/>
+        <w:shd w:val="clear" w:color="ffffff"/>
         <w:tcBorders>
-          <w:top w:val="none"/>
-          <w:left w:val="none"/>
-          <w:bottom w:val="none"/>
+          <w:top w:val="none" w:color="000000" w:sz="4" w:space="0"/>
+          <w:left w:val="none" w:color="000000" w:sz="4" w:space="0"/>
+          <w:bottom w:val="none" w:color="000000" w:sz="4" w:space="0"/>
           <w:right w:val="single" w:color="000000" w:themeColor="accent1" w:themeTint="80" w:sz="4" w:space="0"/>
         </w:tcBorders>
       </w:tcPr>
@@ -12270,10 +12299,10 @@
       <w:tcPr>
         <w:shd w:val="clear" w:color="ffffff" w:themeColor="light1" w:fill="ffffff" w:themeFill="light1"/>
         <w:tcBorders>
-          <w:top w:val="none"/>
-          <w:left w:val="none"/>
+          <w:top w:val="none" w:color="000000" w:sz="4" w:space="0"/>
+          <w:left w:val="none" w:color="000000" w:sz="4" w:space="0"/>
           <w:bottom w:val="single" w:color="000000" w:themeColor="accent1" w:themeTint="80" w:sz="4" w:space="0"/>
-          <w:right w:val="none"/>
+          <w:right w:val="none" w:color="000000" w:sz="4" w:space="0"/>
         </w:tcBorders>
       </w:tcPr>
     </w:tblStylePr>
@@ -12293,12 +12322,12 @@
         <w:tblBorders/>
       </w:tblPr>
       <w:tcPr>
-        <w:shd w:color="ffffff"/>
+        <w:shd w:val="clear" w:color="ffffff"/>
         <w:tcBorders>
-          <w:top w:val="none"/>
+          <w:top w:val="none" w:color="000000" w:sz="4" w:space="0"/>
           <w:left w:val="single" w:color="000000" w:themeColor="accent1" w:themeTint="80" w:sz="4" w:space="0"/>
-          <w:bottom w:val="none"/>
-          <w:right w:val="none"/>
+          <w:bottom w:val="none" w:color="000000" w:sz="4" w:space="0"/>
+          <w:right w:val="none" w:color="000000" w:sz="4" w:space="0"/>
         </w:tcBorders>
       </w:tcPr>
     </w:tblStylePr>
@@ -12321,9 +12350,9 @@
         <w:shd w:val="clear" w:color="ffffff" w:themeColor="light1" w:fill="ffffff" w:themeFill="light1"/>
         <w:tcBorders>
           <w:top w:val="single" w:color="000000" w:themeColor="accent1" w:themeTint="80" w:sz="4" w:space="0"/>
-          <w:left w:val="none"/>
-          <w:bottom w:val="none"/>
-          <w:right w:val="none"/>
+          <w:left w:val="none" w:color="000000" w:sz="4" w:space="0"/>
+          <w:bottom w:val="none" w:color="000000" w:sz="4" w:space="0"/>
+          <w:right w:val="none" w:color="000000" w:sz="4" w:space="0"/>
         </w:tcBorders>
       </w:tcPr>
     </w:tblStylePr>
@@ -12393,9 +12422,9 @@
       </w:tcPr>
     </w:tblStylePr>
   </w:style>
-  <w:style w:type="table" w:styleId="63">
+  <w:style w:type="table" w:styleId="753">
     <w:name w:val="Grid Table 7 Colorful - Accent 2"/>
-    <w:basedOn w:val="11"/>
+    <w:basedOn w:val="701"/>
     <w:uiPriority w:val="99"/>
     <w:pPr>
       <w:pBdr/>
@@ -12497,11 +12526,11 @@
         <w:tblBorders/>
       </w:tblPr>
       <w:tcPr>
-        <w:shd w:color="ffffff"/>
+        <w:shd w:val="clear" w:color="ffffff"/>
         <w:tcBorders>
-          <w:top w:val="none"/>
-          <w:left w:val="none"/>
-          <w:bottom w:val="none"/>
+          <w:top w:val="none" w:color="000000" w:sz="4" w:space="0"/>
+          <w:left w:val="none" w:color="000000" w:sz="4" w:space="0"/>
+          <w:bottom w:val="none" w:color="000000" w:sz="4" w:space="0"/>
           <w:right w:val="single" w:color="000000" w:themeColor="accent2" w:themeTint="97" w:sz="4" w:space="0"/>
         </w:tcBorders>
       </w:tcPr>
@@ -12524,10 +12553,10 @@
       <w:tcPr>
         <w:shd w:val="clear" w:color="ffffff" w:themeColor="light1" w:fill="ffffff" w:themeFill="light1"/>
         <w:tcBorders>
-          <w:top w:val="none"/>
-          <w:left w:val="none"/>
+          <w:top w:val="none" w:color="000000" w:sz="4" w:space="0"/>
+          <w:left w:val="none" w:color="000000" w:sz="4" w:space="0"/>
           <w:bottom w:val="single" w:color="000000" w:themeColor="accent2" w:themeTint="97" w:sz="4" w:space="0"/>
-          <w:right w:val="none"/>
+          <w:right w:val="none" w:color="000000" w:sz="4" w:space="0"/>
         </w:tcBorders>
       </w:tcPr>
     </w:tblStylePr>
@@ -12547,12 +12576,12 @@
         <w:tblBorders/>
       </w:tblPr>
       <w:tcPr>
-        <w:shd w:color="ffffff"/>
+        <w:shd w:val="clear" w:color="ffffff"/>
         <w:tcBorders>
-          <w:top w:val="none"/>
+          <w:top w:val="none" w:color="000000" w:sz="4" w:space="0"/>
           <w:left w:val="single" w:color="000000" w:themeColor="accent2" w:themeTint="97" w:sz="4" w:space="0"/>
-          <w:bottom w:val="none"/>
-          <w:right w:val="none"/>
+          <w:bottom w:val="none" w:color="000000" w:sz="4" w:space="0"/>
+          <w:right w:val="none" w:color="000000" w:sz="4" w:space="0"/>
         </w:tcBorders>
       </w:tcPr>
     </w:tblStylePr>
@@ -12575,9 +12604,9 @@
         <w:shd w:val="clear" w:color="ffffff" w:themeColor="light1" w:fill="ffffff" w:themeFill="light1"/>
         <w:tcBorders>
           <w:top w:val="single" w:color="000000" w:themeColor="accent2" w:themeTint="97" w:sz="4" w:space="0"/>
-          <w:left w:val="none"/>
-          <w:bottom w:val="none"/>
-          <w:right w:val="none"/>
+          <w:left w:val="none" w:color="000000" w:sz="4" w:space="0"/>
+          <w:bottom w:val="none" w:color="000000" w:sz="4" w:space="0"/>
+          <w:right w:val="none" w:color="000000" w:sz="4" w:space="0"/>
         </w:tcBorders>
       </w:tcPr>
     </w:tblStylePr>
@@ -12647,9 +12676,9 @@
       </w:tcPr>
     </w:tblStylePr>
   </w:style>
-  <w:style w:type="table" w:styleId="64">
+  <w:style w:type="table" w:styleId="754">
     <w:name w:val="Grid Table 7 Colorful - Accent 3"/>
-    <w:basedOn w:val="11"/>
+    <w:basedOn w:val="701"/>
     <w:uiPriority w:val="99"/>
     <w:pPr>
       <w:pBdr/>
@@ -12751,11 +12780,11 @@
         <w:tblBorders/>
       </w:tblPr>
       <w:tcPr>
-        <w:shd w:color="ffffff"/>
+        <w:shd w:val="clear" w:color="ffffff"/>
         <w:tcBorders>
-          <w:top w:val="none"/>
-          <w:left w:val="none"/>
-          <w:bottom w:val="none"/>
+          <w:top w:val="none" w:color="000000" w:sz="4" w:space="0"/>
+          <w:left w:val="none" w:color="000000" w:sz="4" w:space="0"/>
+          <w:bottom w:val="none" w:color="000000" w:sz="4" w:space="0"/>
           <w:right w:val="single" w:color="000000" w:themeColor="accent3" w:themeTint="FE" w:sz="4" w:space="0"/>
         </w:tcBorders>
       </w:tcPr>
@@ -12778,10 +12807,10 @@
       <w:tcPr>
         <w:shd w:val="clear" w:color="ffffff" w:themeColor="light1" w:fill="ffffff" w:themeFill="light1"/>
         <w:tcBorders>
-          <w:top w:val="none"/>
-          <w:left w:val="none"/>
+          <w:top w:val="none" w:color="000000" w:sz="4" w:space="0"/>
+          <w:left w:val="none" w:color="000000" w:sz="4" w:space="0"/>
           <w:bottom w:val="single" w:color="000000" w:themeColor="accent3" w:themeTint="FE" w:sz="4" w:space="0"/>
-          <w:right w:val="none"/>
+          <w:right w:val="none" w:color="000000" w:sz="4" w:space="0"/>
         </w:tcBorders>
       </w:tcPr>
     </w:tblStylePr>
@@ -12801,12 +12830,12 @@
         <w:tblBorders/>
       </w:tblPr>
       <w:tcPr>
-        <w:shd w:color="ffffff"/>
+        <w:shd w:val="clear" w:color="ffffff"/>
         <w:tcBorders>
-          <w:top w:val="none"/>
+          <w:top w:val="none" w:color="000000" w:sz="4" w:space="0"/>
           <w:left w:val="single" w:color="000000" w:themeColor="accent3" w:themeTint="FE" w:sz="4" w:space="0"/>
-          <w:bottom w:val="none"/>
-          <w:right w:val="none"/>
+          <w:bottom w:val="none" w:color="000000" w:sz="4" w:space="0"/>
+          <w:right w:val="none" w:color="000000" w:sz="4" w:space="0"/>
         </w:tcBorders>
       </w:tcPr>
     </w:tblStylePr>
@@ -12829,9 +12858,9 @@
         <w:shd w:val="clear" w:color="ffffff" w:themeColor="light1" w:fill="ffffff" w:themeFill="light1"/>
         <w:tcBorders>
           <w:top w:val="single" w:color="000000" w:themeColor="accent3" w:themeTint="FE" w:sz="4" w:space="0"/>
-          <w:left w:val="none"/>
-          <w:bottom w:val="none"/>
-          <w:right w:val="none"/>
+          <w:left w:val="none" w:color="000000" w:sz="4" w:space="0"/>
+          <w:bottom w:val="none" w:color="000000" w:sz="4" w:space="0"/>
+          <w:right w:val="none" w:color="000000" w:sz="4" w:space="0"/>
         </w:tcBorders>
       </w:tcPr>
     </w:tblStylePr>
@@ -12901,9 +12930,9 @@
       </w:tcPr>
     </w:tblStylePr>
   </w:style>
-  <w:style w:type="table" w:styleId="65">
+  <w:style w:type="table" w:styleId="755">
     <w:name w:val="Grid Table 7 Colorful - Accent 4"/>
-    <w:basedOn w:val="11"/>
+    <w:basedOn w:val="701"/>
     <w:uiPriority w:val="99"/>
     <w:pPr>
       <w:pBdr/>
@@ -13005,11 +13034,11 @@
         <w:tblBorders/>
       </w:tblPr>
       <w:tcPr>
-        <w:shd w:color="ffffff"/>
+        <w:shd w:val="clear" w:color="ffffff"/>
         <w:tcBorders>
-          <w:top w:val="none"/>
-          <w:left w:val="none"/>
-          <w:bottom w:val="none"/>
+          <w:top w:val="none" w:color="000000" w:sz="4" w:space="0"/>
+          <w:left w:val="none" w:color="000000" w:sz="4" w:space="0"/>
+          <w:bottom w:val="none" w:color="000000" w:sz="4" w:space="0"/>
           <w:right w:val="single" w:color="000000" w:themeColor="accent4" w:themeTint="9A" w:sz="4" w:space="0"/>
         </w:tcBorders>
       </w:tcPr>
@@ -13032,10 +13061,10 @@
       <w:tcPr>
         <w:shd w:val="clear" w:color="ffffff" w:themeColor="light1" w:fill="ffffff" w:themeFill="light1"/>
         <w:tcBorders>
-          <w:top w:val="none"/>
-          <w:left w:val="none"/>
+          <w:top w:val="none" w:color="000000" w:sz="4" w:space="0"/>
+          <w:left w:val="none" w:color="000000" w:sz="4" w:space="0"/>
           <w:bottom w:val="single" w:color="000000" w:themeColor="accent4" w:themeTint="9A" w:sz="4" w:space="0"/>
-          <w:right w:val="none"/>
+          <w:right w:val="none" w:color="000000" w:sz="4" w:space="0"/>
         </w:tcBorders>
       </w:tcPr>
     </w:tblStylePr>
@@ -13055,12 +13084,12 @@
         <w:tblBorders/>
       </w:tblPr>
       <w:tcPr>
-        <w:shd w:color="ffffff"/>
+        <w:shd w:val="clear" w:color="ffffff"/>
         <w:tcBorders>
-          <w:top w:val="none"/>
+          <w:top w:val="none" w:color="000000" w:sz="4" w:space="0"/>
           <w:left w:val="single" w:color="000000" w:themeColor="accent4" w:themeTint="9A" w:sz="4" w:space="0"/>
-          <w:bottom w:val="none"/>
-          <w:right w:val="none"/>
+          <w:bottom w:val="none" w:color="000000" w:sz="4" w:space="0"/>
+          <w:right w:val="none" w:color="000000" w:sz="4" w:space="0"/>
         </w:tcBorders>
       </w:tcPr>
     </w:tblStylePr>
@@ -13083,9 +13112,9 @@
         <w:shd w:val="clear" w:color="ffffff" w:themeColor="light1" w:fill="ffffff" w:themeFill="light1"/>
         <w:tcBorders>
           <w:top w:val="single" w:color="000000" w:themeColor="accent4" w:themeTint="9A" w:sz="4" w:space="0"/>
-          <w:left w:val="none"/>
-          <w:bottom w:val="none"/>
-          <w:right w:val="none"/>
+          <w:left w:val="none" w:color="000000" w:sz="4" w:space="0"/>
+          <w:bottom w:val="none" w:color="000000" w:sz="4" w:space="0"/>
+          <w:right w:val="none" w:color="000000" w:sz="4" w:space="0"/>
         </w:tcBorders>
       </w:tcPr>
     </w:tblStylePr>
@@ -13155,9 +13184,9 @@
       </w:tcPr>
     </w:tblStylePr>
   </w:style>
-  <w:style w:type="table" w:styleId="66">
+  <w:style w:type="table" w:styleId="756">
     <w:name w:val="Grid Table 7 Colorful - Accent 5"/>
-    <w:basedOn w:val="11"/>
+    <w:basedOn w:val="701"/>
     <w:uiPriority w:val="99"/>
     <w:pPr>
       <w:pBdr/>
@@ -13259,11 +13288,11 @@
         <w:tblBorders/>
       </w:tblPr>
       <w:tcPr>
-        <w:shd w:color="ffffff"/>
+        <w:shd w:val="clear" w:color="ffffff"/>
         <w:tcBorders>
-          <w:top w:val="none"/>
-          <w:left w:val="none"/>
-          <w:bottom w:val="none"/>
+          <w:top w:val="none" w:color="000000" w:sz="4" w:space="0"/>
+          <w:left w:val="none" w:color="000000" w:sz="4" w:space="0"/>
+          <w:bottom w:val="none" w:color="000000" w:sz="4" w:space="0"/>
           <w:right w:val="single" w:color="000000" w:themeColor="accent5" w:themeTint="90" w:sz="4" w:space="0"/>
         </w:tcBorders>
       </w:tcPr>
@@ -13286,10 +13315,10 @@
       <w:tcPr>
         <w:shd w:val="clear" w:color="ffffff" w:themeColor="light1" w:fill="ffffff" w:themeFill="light1"/>
         <w:tcBorders>
-          <w:top w:val="none"/>
-          <w:left w:val="none"/>
+          <w:top w:val="none" w:color="000000" w:sz="4" w:space="0"/>
+          <w:left w:val="none" w:color="000000" w:sz="4" w:space="0"/>
           <w:bottom w:val="single" w:color="000000" w:themeColor="accent5" w:themeTint="90" w:sz="4" w:space="0"/>
-          <w:right w:val="none"/>
+          <w:right w:val="none" w:color="000000" w:sz="4" w:space="0"/>
         </w:tcBorders>
       </w:tcPr>
     </w:tblStylePr>
@@ -13309,12 +13338,12 @@
         <w:tblBorders/>
       </w:tblPr>
       <w:tcPr>
-        <w:shd w:color="ffffff"/>
+        <w:shd w:val="clear" w:color="ffffff"/>
         <w:tcBorders>
-          <w:top w:val="none"/>
+          <w:top w:val="none" w:color="000000" w:sz="4" w:space="0"/>
           <w:left w:val="single" w:color="000000" w:themeColor="accent5" w:themeTint="90" w:sz="4" w:space="0"/>
-          <w:bottom w:val="none"/>
-          <w:right w:val="none"/>
+          <w:bottom w:val="none" w:color="000000" w:sz="4" w:space="0"/>
+          <w:right w:val="none" w:color="000000" w:sz="4" w:space="0"/>
         </w:tcBorders>
       </w:tcPr>
     </w:tblStylePr>
@@ -13337,9 +13366,9 @@
         <w:shd w:val="clear" w:color="ffffff" w:themeColor="light1" w:fill="ffffff" w:themeFill="light1"/>
         <w:tcBorders>
           <w:top w:val="single" w:color="000000" w:themeColor="accent5" w:themeTint="90" w:sz="4" w:space="0"/>
-          <w:left w:val="none"/>
-          <w:bottom w:val="none"/>
-          <w:right w:val="none"/>
+          <w:left w:val="none" w:color="000000" w:sz="4" w:space="0"/>
+          <w:bottom w:val="none" w:color="000000" w:sz="4" w:space="0"/>
+          <w:right w:val="none" w:color="000000" w:sz="4" w:space="0"/>
         </w:tcBorders>
       </w:tcPr>
     </w:tblStylePr>
@@ -13409,9 +13438,9 @@
       </w:tcPr>
     </w:tblStylePr>
   </w:style>
-  <w:style w:type="table" w:styleId="67">
+  <w:style w:type="table" w:styleId="757">
     <w:name w:val="Grid Table 7 Colorful - Accent 6"/>
-    <w:basedOn w:val="11"/>
+    <w:basedOn w:val="701"/>
     <w:uiPriority w:val="99"/>
     <w:pPr>
       <w:pBdr/>
@@ -13513,11 +13542,11 @@
         <w:tblBorders/>
       </w:tblPr>
       <w:tcPr>
-        <w:shd w:color="ffffff"/>
+        <w:shd w:val="clear" w:color="ffffff"/>
         <w:tcBorders>
-          <w:top w:val="none"/>
-          <w:left w:val="none"/>
-          <w:bottom w:val="none"/>
+          <w:top w:val="none" w:color="000000" w:sz="4" w:space="0"/>
+          <w:left w:val="none" w:color="000000" w:sz="4" w:space="0"/>
+          <w:bottom w:val="none" w:color="000000" w:sz="4" w:space="0"/>
           <w:right w:val="single" w:color="000000" w:themeColor="accent6" w:themeTint="90" w:sz="4" w:space="0"/>
         </w:tcBorders>
       </w:tcPr>
@@ -13540,10 +13569,10 @@
       <w:tcPr>
         <w:shd w:val="clear" w:color="ffffff" w:themeColor="light1" w:fill="ffffff" w:themeFill="light1"/>
         <w:tcBorders>
-          <w:top w:val="none"/>
-          <w:left w:val="none"/>
+          <w:top w:val="none" w:color="000000" w:sz="4" w:space="0"/>
+          <w:left w:val="none" w:color="000000" w:sz="4" w:space="0"/>
           <w:bottom w:val="single" w:color="000000" w:themeColor="accent6" w:themeTint="90" w:sz="4" w:space="0"/>
-          <w:right w:val="none"/>
+          <w:right w:val="none" w:color="000000" w:sz="4" w:space="0"/>
         </w:tcBorders>
       </w:tcPr>
     </w:tblStylePr>
@@ -13563,12 +13592,12 @@
         <w:tblBorders/>
       </w:tblPr>
       <w:tcPr>
-        <w:shd w:color="ffffff"/>
+        <w:shd w:val="clear" w:color="ffffff"/>
         <w:tcBorders>
-          <w:top w:val="none"/>
+          <w:top w:val="none" w:color="000000" w:sz="4" w:space="0"/>
           <w:left w:val="single" w:color="000000" w:themeColor="accent6" w:themeTint="90" w:sz="4" w:space="0"/>
-          <w:bottom w:val="none"/>
-          <w:right w:val="none"/>
+          <w:bottom w:val="none" w:color="000000" w:sz="4" w:space="0"/>
+          <w:right w:val="none" w:color="000000" w:sz="4" w:space="0"/>
         </w:tcBorders>
       </w:tcPr>
     </w:tblStylePr>
@@ -13591,9 +13620,9 @@
         <w:shd w:val="clear" w:color="ffffff" w:themeColor="light1" w:fill="ffffff" w:themeFill="light1"/>
         <w:tcBorders>
           <w:top w:val="single" w:color="000000" w:themeColor="accent6" w:themeTint="90" w:sz="4" w:space="0"/>
-          <w:left w:val="none"/>
-          <w:bottom w:val="none"/>
-          <w:right w:val="none"/>
+          <w:left w:val="none" w:color="000000" w:sz="4" w:space="0"/>
+          <w:bottom w:val="none" w:color="000000" w:sz="4" w:space="0"/>
+          <w:right w:val="none" w:color="000000" w:sz="4" w:space="0"/>
         </w:tcBorders>
       </w:tcPr>
     </w:tblStylePr>
@@ -13663,9 +13692,9 @@
       </w:tcPr>
     </w:tblStylePr>
   </w:style>
-  <w:style w:type="table" w:styleId="68">
+  <w:style w:type="table" w:styleId="758">
     <w:name w:val="List Table 1 Light"/>
-    <w:basedOn w:val="11"/>
+    <w:basedOn w:val="701"/>
     <w:uiPriority w:val="99"/>
     <w:pPr>
       <w:pBdr/>
@@ -13879,9 +13908,9 @@
       </w:tcPr>
     </w:tblStylePr>
   </w:style>
-  <w:style w:type="table" w:styleId="69">
+  <w:style w:type="table" w:styleId="759">
     <w:name w:val="List Table 1 Light - Accent 1"/>
-    <w:basedOn w:val="11"/>
+    <w:basedOn w:val="701"/>
     <w:uiPriority w:val="99"/>
     <w:pPr>
       <w:pBdr/>
@@ -14095,9 +14124,9 @@
       </w:tcPr>
     </w:tblStylePr>
   </w:style>
-  <w:style w:type="table" w:styleId="70">
+  <w:style w:type="table" w:styleId="760">
     <w:name w:val="List Table 1 Light - Accent 2"/>
-    <w:basedOn w:val="11"/>
+    <w:basedOn w:val="701"/>
     <w:uiPriority w:val="99"/>
     <w:pPr>
       <w:pBdr/>
@@ -14311,9 +14340,9 @@
       </w:tcPr>
     </w:tblStylePr>
   </w:style>
-  <w:style w:type="table" w:styleId="71">
+  <w:style w:type="table" w:styleId="761">
     <w:name w:val="List Table 1 Light - Accent 3"/>
-    <w:basedOn w:val="11"/>
+    <w:basedOn w:val="701"/>
     <w:uiPriority w:val="99"/>
     <w:pPr>
       <w:pBdr/>
@@ -14527,9 +14556,9 @@
       </w:tcPr>
     </w:tblStylePr>
   </w:style>
-  <w:style w:type="table" w:styleId="72">
+  <w:style w:type="table" w:styleId="762">
     <w:name w:val="List Table 1 Light - Accent 4"/>
-    <w:basedOn w:val="11"/>
+    <w:basedOn w:val="701"/>
     <w:uiPriority w:val="99"/>
     <w:pPr>
       <w:pBdr/>
@@ -14743,9 +14772,9 @@
       </w:tcPr>
     </w:tblStylePr>
   </w:style>
-  <w:style w:type="table" w:styleId="73">
+  <w:style w:type="table" w:styleId="763">
     <w:name w:val="List Table 1 Light - Accent 5"/>
-    <w:basedOn w:val="11"/>
+    <w:basedOn w:val="701"/>
     <w:uiPriority w:val="99"/>
     <w:pPr>
       <w:pBdr/>
@@ -14959,9 +14988,9 @@
       </w:tcPr>
     </w:tblStylePr>
   </w:style>
-  <w:style w:type="table" w:styleId="74">
+  <w:style w:type="table" w:styleId="764">
     <w:name w:val="List Table 1 Light - Accent 6"/>
-    <w:basedOn w:val="11"/>
+    <w:basedOn w:val="701"/>
     <w:uiPriority w:val="99"/>
     <w:pPr>
       <w:pBdr/>
@@ -15175,9 +15204,9 @@
       </w:tcPr>
     </w:tblStylePr>
   </w:style>
-  <w:style w:type="table" w:styleId="75">
+  <w:style w:type="table" w:styleId="765">
     <w:name w:val="List Table 2"/>
-    <w:basedOn w:val="11"/>
+    <w:basedOn w:val="701"/>
     <w:uiPriority w:val="99"/>
     <w:pPr>
       <w:pBdr/>
@@ -15413,9 +15442,9 @@
       </w:tcPr>
     </w:tblStylePr>
   </w:style>
-  <w:style w:type="table" w:styleId="76">
+  <w:style w:type="table" w:styleId="766">
     <w:name w:val="List Table 2 - Accent 1"/>
-    <w:basedOn w:val="11"/>
+    <w:basedOn w:val="701"/>
     <w:uiPriority w:val="99"/>
     <w:pPr>
       <w:pBdr/>
@@ -15651,9 +15680,9 @@
       </w:tcPr>
     </w:tblStylePr>
   </w:style>
-  <w:style w:type="table" w:styleId="77">
+  <w:style w:type="table" w:styleId="767">
     <w:name w:val="List Table 2 - Accent 2"/>
-    <w:basedOn w:val="11"/>
+    <w:basedOn w:val="701"/>
     <w:uiPriority w:val="99"/>
     <w:pPr>
       <w:pBdr/>
@@ -15889,9 +15918,9 @@
       </w:tcPr>
     </w:tblStylePr>
   </w:style>
-  <w:style w:type="table" w:styleId="78">
+  <w:style w:type="table" w:styleId="768">
     <w:name w:val="List Table 2 - Accent 3"/>
-    <w:basedOn w:val="11"/>
+    <w:basedOn w:val="701"/>
     <w:uiPriority w:val="99"/>
     <w:pPr>
       <w:pBdr/>
@@ -16127,9 +16156,9 @@
       </w:tcPr>
     </w:tblStylePr>
   </w:style>
-  <w:style w:type="table" w:styleId="79">
+  <w:style w:type="table" w:styleId="769">
     <w:name w:val="List Table 2 - Accent 4"/>
-    <w:basedOn w:val="11"/>
+    <w:basedOn w:val="701"/>
     <w:uiPriority w:val="99"/>
     <w:pPr>
       <w:pBdr/>
@@ -16365,9 +16394,9 @@
       </w:tcPr>
     </w:tblStylePr>
   </w:style>
-  <w:style w:type="table" w:styleId="80">
+  <w:style w:type="table" w:styleId="770">
     <w:name w:val="List Table 2 - Accent 5"/>
-    <w:basedOn w:val="11"/>
+    <w:basedOn w:val="701"/>
     <w:uiPriority w:val="99"/>
     <w:pPr>
       <w:pBdr/>
@@ -16603,9 +16632,9 @@
       </w:tcPr>
     </w:tblStylePr>
   </w:style>
-  <w:style w:type="table" w:styleId="81">
+  <w:style w:type="table" w:styleId="771">
     <w:name w:val="List Table 2 - Accent 6"/>
-    <w:basedOn w:val="11"/>
+    <w:basedOn w:val="701"/>
     <w:uiPriority w:val="99"/>
     <w:pPr>
       <w:pBdr/>
@@ -16841,9 +16870,9 @@
       </w:tcPr>
     </w:tblStylePr>
   </w:style>
-  <w:style w:type="table" w:styleId="82">
+  <w:style w:type="table" w:styleId="772">
     <w:name w:val="List Table 3"/>
-    <w:basedOn w:val="11"/>
+    <w:basedOn w:val="701"/>
     <w:uiPriority w:val="99"/>
     <w:pPr>
       <w:pBdr/>
@@ -17069,9 +17098,9 @@
       </w:tcPr>
     </w:tblStylePr>
   </w:style>
-  <w:style w:type="table" w:styleId="83">
+  <w:style w:type="table" w:styleId="773">
     <w:name w:val="List Table 3 - Accent 1"/>
-    <w:basedOn w:val="11"/>
+    <w:basedOn w:val="701"/>
     <w:uiPriority w:val="99"/>
     <w:pPr>
       <w:pBdr/>
@@ -17297,9 +17326,9 @@
       </w:tcPr>
     </w:tblStylePr>
   </w:style>
-  <w:style w:type="table" w:styleId="84">
+  <w:style w:type="table" w:styleId="774">
     <w:name w:val="List Table 3 - Accent 2"/>
-    <w:basedOn w:val="11"/>
+    <w:basedOn w:val="701"/>
     <w:uiPriority w:val="99"/>
     <w:pPr>
       <w:pBdr/>
@@ -17525,9 +17554,9 @@
       </w:tcPr>
     </w:tblStylePr>
   </w:style>
-  <w:style w:type="table" w:styleId="85">
+  <w:style w:type="table" w:styleId="775">
     <w:name w:val="List Table 3 - Accent 3"/>
-    <w:basedOn w:val="11"/>
+    <w:basedOn w:val="701"/>
     <w:uiPriority w:val="99"/>
     <w:pPr>
       <w:pBdr/>
@@ -17753,9 +17782,9 @@
       </w:tcPr>
     </w:tblStylePr>
   </w:style>
-  <w:style w:type="table" w:styleId="86">
+  <w:style w:type="table" w:styleId="776">
     <w:name w:val="List Table 3 - Accent 4"/>
-    <w:basedOn w:val="11"/>
+    <w:basedOn w:val="701"/>
     <w:uiPriority w:val="99"/>
     <w:pPr>
       <w:pBdr/>
@@ -17981,9 +18010,9 @@
       </w:tcPr>
     </w:tblStylePr>
   </w:style>
-  <w:style w:type="table" w:styleId="87">
+  <w:style w:type="table" w:styleId="777">
     <w:name w:val="List Table 3 - Accent 5"/>
-    <w:basedOn w:val="11"/>
+    <w:basedOn w:val="701"/>
     <w:uiPriority w:val="99"/>
     <w:pPr>
       <w:pBdr/>
@@ -18209,9 +18238,9 @@
       </w:tcPr>
     </w:tblStylePr>
   </w:style>
-  <w:style w:type="table" w:styleId="88">
+  <w:style w:type="table" w:styleId="778">
     <w:name w:val="List Table 3 - Accent 6"/>
-    <w:basedOn w:val="11"/>
+    <w:basedOn w:val="701"/>
     <w:uiPriority w:val="99"/>
     <w:pPr>
       <w:pBdr/>
@@ -18437,9 +18466,9 @@
       </w:tcPr>
     </w:tblStylePr>
   </w:style>
-  <w:style w:type="table" w:styleId="89">
+  <w:style w:type="table" w:styleId="779">
     <w:name w:val="List Table 4"/>
-    <w:basedOn w:val="11"/>
+    <w:basedOn w:val="701"/>
     <w:uiPriority w:val="99"/>
     <w:pPr>
       <w:pBdr/>
@@ -18662,9 +18691,9 @@
       </w:tcPr>
     </w:tblStylePr>
   </w:style>
-  <w:style w:type="table" w:styleId="90">
+  <w:style w:type="table" w:styleId="780">
     <w:name w:val="List Table 4 - Accent 1"/>
-    <w:basedOn w:val="11"/>
+    <w:basedOn w:val="701"/>
     <w:uiPriority w:val="99"/>
     <w:pPr>
       <w:pBdr/>
@@ -18887,9 +18916,9 @@
       </w:tcPr>
     </w:tblStylePr>
   </w:style>
-  <w:style w:type="table" w:styleId="91">
+  <w:style w:type="table" w:styleId="781">
     <w:name w:val="List Table 4 - Accent 2"/>
-    <w:basedOn w:val="11"/>
+    <w:basedOn w:val="701"/>
     <w:uiPriority w:val="99"/>
     <w:pPr>
       <w:pBdr/>
@@ -19112,9 +19141,9 @@
       </w:tcPr>
     </w:tblStylePr>
   </w:style>
-  <w:style w:type="table" w:styleId="92">
+  <w:style w:type="table" w:styleId="782">
     <w:name w:val="List Table 4 - Accent 3"/>
-    <w:basedOn w:val="11"/>
+    <w:basedOn w:val="701"/>
     <w:uiPriority w:val="99"/>
     <w:pPr>
       <w:pBdr/>
@@ -19337,9 +19366,9 @@
       </w:tcPr>
     </w:tblStylePr>
   </w:style>
-  <w:style w:type="table" w:styleId="93">
+  <w:style w:type="table" w:styleId="783">
     <w:name w:val="List Table 4 - Accent 4"/>
-    <w:basedOn w:val="11"/>
+    <w:basedOn w:val="701"/>
     <w:uiPriority w:val="99"/>
     <w:pPr>
       <w:pBdr/>
@@ -19562,9 +19591,9 @@
       </w:tcPr>
     </w:tblStylePr>
   </w:style>
-  <w:style w:type="table" w:styleId="94">
+  <w:style w:type="table" w:styleId="784">
     <w:name w:val="List Table 4 - Accent 5"/>
-    <w:basedOn w:val="11"/>
+    <w:basedOn w:val="701"/>
     <w:uiPriority w:val="99"/>
     <w:pPr>
       <w:pBdr/>
@@ -19787,9 +19816,9 @@
       </w:tcPr>
     </w:tblStylePr>
   </w:style>
-  <w:style w:type="table" w:styleId="95">
+  <w:style w:type="table" w:styleId="785">
     <w:name w:val="List Table 4 - Accent 6"/>
-    <w:basedOn w:val="11"/>
+    <w:basedOn w:val="701"/>
     <w:uiPriority w:val="99"/>
     <w:pPr>
       <w:pBdr/>
@@ -20012,9 +20041,9 @@
       </w:tcPr>
     </w:tblStylePr>
   </w:style>
-  <w:style w:type="table" w:styleId="96">
+  <w:style w:type="table" w:styleId="786">
     <w:name w:val="List Table 5 Dark"/>
-    <w:basedOn w:val="11"/>
+    <w:basedOn w:val="701"/>
     <w:uiPriority w:val="99"/>
     <w:pPr>
       <w:pBdr/>
@@ -20254,9 +20283,9 @@
       </w:tcPr>
     </w:tblStylePr>
   </w:style>
-  <w:style w:type="table" w:styleId="97">
+  <w:style w:type="table" w:styleId="787">
     <w:name w:val="List Table 5 Dark - Accent 1"/>
-    <w:basedOn w:val="11"/>
+    <w:basedOn w:val="701"/>
     <w:uiPriority w:val="99"/>
     <w:pPr>
       <w:pBdr/>
@@ -20496,9 +20525,9 @@
       </w:tcPr>
     </w:tblStylePr>
   </w:style>
-  <w:style w:type="table" w:styleId="98">
+  <w:style w:type="table" w:styleId="788">
     <w:name w:val="List Table 5 Dark - Accent 2"/>
-    <w:basedOn w:val="11"/>
+    <w:basedOn w:val="701"/>
     <w:uiPriority w:val="99"/>
     <w:pPr>
       <w:pBdr/>
@@ -20738,9 +20767,9 @@
       </w:tcPr>
     </w:tblStylePr>
   </w:style>
-  <w:style w:type="table" w:styleId="99">
+  <w:style w:type="table" w:styleId="789">
     <w:name w:val="List Table 5 Dark - Accent 3"/>
-    <w:basedOn w:val="11"/>
+    <w:basedOn w:val="701"/>
     <w:uiPriority w:val="99"/>
     <w:pPr>
       <w:pBdr/>
@@ -20980,9 +21009,9 @@
       </w:tcPr>
     </w:tblStylePr>
   </w:style>
-  <w:style w:type="table" w:styleId="100">
+  <w:style w:type="table" w:styleId="790">
     <w:name w:val="List Table 5 Dark - Accent 4"/>
-    <w:basedOn w:val="11"/>
+    <w:basedOn w:val="701"/>
     <w:uiPriority w:val="99"/>
     <w:pPr>
       <w:pBdr/>
@@ -21222,9 +21251,9 @@
       </w:tcPr>
     </w:tblStylePr>
   </w:style>
-  <w:style w:type="table" w:styleId="101">
+  <w:style w:type="table" w:styleId="791">
     <w:name w:val="List Table 5 Dark - Accent 5"/>
-    <w:basedOn w:val="11"/>
+    <w:basedOn w:val="701"/>
     <w:uiPriority w:val="99"/>
     <w:pPr>
       <w:pBdr/>
@@ -21464,9 +21493,9 @@
       </w:tcPr>
     </w:tblStylePr>
   </w:style>
-  <w:style w:type="table" w:styleId="102">
+  <w:style w:type="table" w:styleId="792">
     <w:name w:val="List Table 5 Dark - Accent 6"/>
-    <w:basedOn w:val="11"/>
+    <w:basedOn w:val="701"/>
     <w:uiPriority w:val="99"/>
     <w:pPr>
       <w:pBdr/>
@@ -21706,9 +21735,9 @@
       </w:tcPr>
     </w:tblStylePr>
   </w:style>
-  <w:style w:type="table" w:styleId="103">
+  <w:style w:type="table" w:styleId="793">
     <w:name w:val="List Table 6 Colorful"/>
-    <w:basedOn w:val="11"/>
+    <w:basedOn w:val="701"/>
     <w:uiPriority w:val="99"/>
     <w:pPr>
       <w:pBdr/>
@@ -21929,9 +21958,9 @@
       </w:tcPr>
     </w:tblStylePr>
   </w:style>
-  <w:style w:type="table" w:styleId="104">
+  <w:style w:type="table" w:styleId="794">
     <w:name w:val="List Table 6 Colorful - Accent 1"/>
-    <w:basedOn w:val="11"/>
+    <w:basedOn w:val="701"/>
     <w:uiPriority w:val="99"/>
     <w:pPr>
       <w:pBdr/>
@@ -22152,9 +22181,9 @@
       </w:tcPr>
     </w:tblStylePr>
   </w:style>
-  <w:style w:type="table" w:styleId="105">
+  <w:style w:type="table" w:styleId="795">
     <w:name w:val="List Table 6 Colorful - Accent 2"/>
-    <w:basedOn w:val="11"/>
+    <w:basedOn w:val="701"/>
     <w:uiPriority w:val="99"/>
     <w:pPr>
       <w:pBdr/>
@@ -22375,9 +22404,9 @@
       </w:tcPr>
     </w:tblStylePr>
   </w:style>
-  <w:style w:type="table" w:styleId="106">
+  <w:style w:type="table" w:styleId="796">
     <w:name w:val="List Table 6 Colorful - Accent 3"/>
-    <w:basedOn w:val="11"/>
+    <w:basedOn w:val="701"/>
     <w:uiPriority w:val="99"/>
     <w:pPr>
       <w:pBdr/>
@@ -22598,9 +22627,9 @@
       </w:tcPr>
     </w:tblStylePr>
   </w:style>
-  <w:style w:type="table" w:styleId="107">
+  <w:style w:type="table" w:styleId="797">
     <w:name w:val="List Table 6 Colorful - Accent 4"/>
-    <w:basedOn w:val="11"/>
+    <w:basedOn w:val="701"/>
     <w:uiPriority w:val="99"/>
     <w:pPr>
       <w:pBdr/>
@@ -22821,9 +22850,9 @@
       </w:tcPr>
     </w:tblStylePr>
   </w:style>
-  <w:style w:type="table" w:styleId="108">
+  <w:style w:type="table" w:styleId="798">
     <w:name w:val="List Table 6 Colorful - Accent 5"/>
-    <w:basedOn w:val="11"/>
+    <w:basedOn w:val="701"/>
     <w:uiPriority w:val="99"/>
     <w:pPr>
       <w:pBdr/>
@@ -23044,9 +23073,9 @@
       </w:tcPr>
     </w:tblStylePr>
   </w:style>
-  <w:style w:type="table" w:styleId="109">
+  <w:style w:type="table" w:styleId="799">
     <w:name w:val="List Table 6 Colorful - Accent 6"/>
-    <w:basedOn w:val="11"/>
+    <w:basedOn w:val="701"/>
     <w:uiPriority w:val="99"/>
     <w:pPr>
       <w:pBdr/>
@@ -23267,9 +23296,9 @@
       </w:tcPr>
     </w:tblStylePr>
   </w:style>
-  <w:style w:type="table" w:styleId="110">
+  <w:style w:type="table" w:styleId="800">
     <w:name w:val="List Table 7 Colorful"/>
-    <w:basedOn w:val="11"/>
+    <w:basedOn w:val="701"/>
     <w:uiPriority w:val="99"/>
     <w:pPr>
       <w:pBdr/>
@@ -23368,11 +23397,11 @@
         <w:tblBorders/>
       </w:tblPr>
       <w:tcPr>
-        <w:shd w:color="ffffff"/>
+        <w:shd w:val="clear" w:color="ffffff"/>
         <w:tcBorders>
-          <w:top w:val="none"/>
-          <w:left w:val="none"/>
-          <w:bottom w:val="none"/>
+          <w:top w:val="none" w:color="000000" w:sz="4" w:space="0"/>
+          <w:left w:val="none" w:color="000000" w:sz="4" w:space="0"/>
+          <w:bottom w:val="none" w:color="000000" w:sz="4" w:space="0"/>
           <w:right w:val="single" w:color="000000" w:themeColor="text1" w:themeTint="80" w:sz="4" w:space="0"/>
         </w:tcBorders>
       </w:tcPr>
@@ -23395,10 +23424,10 @@
       <w:tcPr>
         <w:shd w:val="clear" w:color="ffffff" w:themeColor="light1" w:fill="ffffff" w:themeFill="light1"/>
         <w:tcBorders>
-          <w:top w:val="none"/>
-          <w:left w:val="none"/>
+          <w:top w:val="none" w:color="000000" w:sz="4" w:space="0"/>
+          <w:left w:val="none" w:color="000000" w:sz="4" w:space="0"/>
           <w:bottom w:val="single" w:color="000000" w:themeColor="text1" w:themeTint="80" w:sz="4" w:space="0"/>
-          <w:right w:val="none"/>
+          <w:right w:val="none" w:color="000000" w:sz="4" w:space="0"/>
         </w:tcBorders>
       </w:tcPr>
     </w:tblStylePr>
@@ -23418,12 +23447,12 @@
         <w:tblBorders/>
       </w:tblPr>
       <w:tcPr>
-        <w:shd w:color="ffffff"/>
+        <w:shd w:val="clear" w:color="ffffff"/>
         <w:tcBorders>
-          <w:top w:val="none"/>
+          <w:top w:val="none" w:color="000000" w:sz="4" w:space="0"/>
           <w:left w:val="single" w:color="000000" w:themeColor="text1" w:themeTint="80" w:sz="4" w:space="0"/>
-          <w:bottom w:val="none"/>
-          <w:right w:val="none"/>
+          <w:bottom w:val="none" w:color="000000" w:sz="4" w:space="0"/>
+          <w:right w:val="none" w:color="000000" w:sz="4" w:space="0"/>
         </w:tcBorders>
       </w:tcPr>
     </w:tblStylePr>
@@ -23446,9 +23475,9 @@
         <w:shd w:val="clear" w:color="ffffff" w:themeColor="light1" w:fill="ffffff" w:themeFill="light1"/>
         <w:tcBorders>
           <w:top w:val="single" w:color="000000" w:themeColor="text1" w:themeTint="80" w:sz="4" w:space="0"/>
-          <w:left w:val="none"/>
-          <w:bottom w:val="none"/>
-          <w:right w:val="none"/>
+          <w:left w:val="none" w:color="000000" w:sz="4" w:space="0"/>
+          <w:bottom w:val="none" w:color="000000" w:sz="4" w:space="0"/>
+          <w:right w:val="none" w:color="000000" w:sz="4" w:space="0"/>
         </w:tcBorders>
       </w:tcPr>
     </w:tblStylePr>
@@ -23523,9 +23552,9 @@
       </w:tcPr>
     </w:tblStylePr>
   </w:style>
-  <w:style w:type="table" w:styleId="111">
+  <w:style w:type="table" w:styleId="801">
     <w:name w:val="List Table 7 Colorful - Accent 1"/>
-    <w:basedOn w:val="11"/>
+    <w:basedOn w:val="701"/>
     <w:uiPriority w:val="99"/>
     <w:pPr>
       <w:pBdr/>
@@ -23624,11 +23653,11 @@
         <w:tblBorders/>
       </w:tblPr>
       <w:tcPr>
-        <w:shd w:color="ffffff"/>
+        <w:shd w:val="clear" w:color="ffffff"/>
         <w:tcBorders>
-          <w:top w:val="none"/>
-          <w:left w:val="none"/>
-          <w:bottom w:val="none"/>
+          <w:top w:val="none" w:color="000000" w:sz="4" w:space="0"/>
+          <w:left w:val="none" w:color="000000" w:sz="4" w:space="0"/>
+          <w:bottom w:val="none" w:color="000000" w:sz="4" w:space="0"/>
           <w:right w:val="single" w:color="000000" w:themeColor="accent1" w:sz="4" w:space="0"/>
         </w:tcBorders>
       </w:tcPr>
@@ -23651,10 +23680,10 @@
       <w:tcPr>
         <w:shd w:val="clear" w:color="ffffff" w:themeColor="light1" w:fill="ffffff" w:themeFill="light1"/>
         <w:tcBorders>
-          <w:top w:val="none"/>
-          <w:left w:val="none"/>
+          <w:top w:val="none" w:color="000000" w:sz="4" w:space="0"/>
+          <w:left w:val="none" w:color="000000" w:sz="4" w:space="0"/>
           <w:bottom w:val="single" w:color="000000" w:themeColor="accent1" w:sz="4" w:space="0"/>
-          <w:right w:val="none"/>
+          <w:right w:val="none" w:color="000000" w:sz="4" w:space="0"/>
         </w:tcBorders>
       </w:tcPr>
     </w:tblStylePr>
@@ -23674,12 +23703,12 @@
         <w:tblBorders/>
       </w:tblPr>
       <w:tcPr>
-        <w:shd w:color="ffffff"/>
+        <w:shd w:val="clear" w:color="ffffff"/>
         <w:tcBorders>
-          <w:top w:val="none"/>
+          <w:top w:val="none" w:color="000000" w:sz="4" w:space="0"/>
           <w:left w:val="single" w:color="000000" w:themeColor="accent1" w:sz="4" w:space="0"/>
-          <w:bottom w:val="none"/>
-          <w:right w:val="none"/>
+          <w:bottom w:val="none" w:color="000000" w:sz="4" w:space="0"/>
+          <w:right w:val="none" w:color="000000" w:sz="4" w:space="0"/>
         </w:tcBorders>
       </w:tcPr>
     </w:tblStylePr>
@@ -23702,9 +23731,9 @@
         <w:shd w:val="clear" w:color="ffffff" w:themeColor="light1" w:fill="ffffff" w:themeFill="light1"/>
         <w:tcBorders>
           <w:top w:val="single" w:color="000000" w:themeColor="accent1" w:sz="4" w:space="0"/>
-          <w:left w:val="none"/>
-          <w:bottom w:val="none"/>
-          <w:right w:val="none"/>
+          <w:left w:val="none" w:color="000000" w:sz="4" w:space="0"/>
+          <w:bottom w:val="none" w:color="000000" w:sz="4" w:space="0"/>
+          <w:right w:val="none" w:color="000000" w:sz="4" w:space="0"/>
         </w:tcBorders>
       </w:tcPr>
     </w:tblStylePr>
@@ -23779,9 +23808,9 @@
       </w:tcPr>
     </w:tblStylePr>
   </w:style>
-  <w:style w:type="table" w:styleId="112">
+  <w:style w:type="table" w:styleId="802">
     <w:name w:val="List Table 7 Colorful - Accent 2"/>
-    <w:basedOn w:val="11"/>
+    <w:basedOn w:val="701"/>
     <w:uiPriority w:val="99"/>
     <w:pPr>
       <w:pBdr/>
@@ -23880,11 +23909,11 @@
         <w:tblBorders/>
       </w:tblPr>
       <w:tcPr>
-        <w:shd w:color="ffffff"/>
+        <w:shd w:val="clear" w:color="ffffff"/>
         <w:tcBorders>
-          <w:top w:val="none"/>
-          <w:left w:val="none"/>
-          <w:bottom w:val="none"/>
+          <w:top w:val="none" w:color="000000" w:sz="4" w:space="0"/>
+          <w:left w:val="none" w:color="000000" w:sz="4" w:space="0"/>
+          <w:bottom w:val="none" w:color="000000" w:sz="4" w:space="0"/>
           <w:right w:val="single" w:color="000000" w:themeColor="accent2" w:themeTint="97" w:sz="4" w:space="0"/>
         </w:tcBorders>
       </w:tcPr>
@@ -23907,10 +23936,10 @@
       <w:tcPr>
         <w:shd w:val="clear" w:color="ffffff" w:themeColor="light1" w:fill="ffffff" w:themeFill="light1"/>
         <w:tcBorders>
-          <w:top w:val="none"/>
-          <w:left w:val="none"/>
+          <w:top w:val="none" w:color="000000" w:sz="4" w:space="0"/>
+          <w:left w:val="none" w:color="000000" w:sz="4" w:space="0"/>
           <w:bottom w:val="single" w:color="000000" w:themeColor="accent2" w:themeTint="97" w:sz="4" w:space="0"/>
-          <w:right w:val="none"/>
+          <w:right w:val="none" w:color="000000" w:sz="4" w:space="0"/>
         </w:tcBorders>
       </w:tcPr>
     </w:tblStylePr>
@@ -23930,12 +23959,12 @@
         <w:tblBorders/>
       </w:tblPr>
       <w:tcPr>
-        <w:shd w:color="ffffff"/>
+        <w:shd w:val="clear" w:color="ffffff"/>
         <w:tcBorders>
-          <w:top w:val="none"/>
+          <w:top w:val="none" w:color="000000" w:sz="4" w:space="0"/>
           <w:left w:val="single" w:color="000000" w:themeColor="accent2" w:themeTint="97" w:sz="4" w:space="0"/>
-          <w:bottom w:val="none"/>
-          <w:right w:val="none"/>
+          <w:bottom w:val="none" w:color="000000" w:sz="4" w:space="0"/>
+          <w:right w:val="none" w:color="000000" w:sz="4" w:space="0"/>
         </w:tcBorders>
       </w:tcPr>
     </w:tblStylePr>
@@ -23958,9 +23987,9 @@
         <w:shd w:val="clear" w:color="ffffff" w:themeColor="light1" w:fill="ffffff" w:themeFill="light1"/>
         <w:tcBorders>
           <w:top w:val="single" w:color="000000" w:themeColor="accent2" w:themeTint="97" w:sz="4" w:space="0"/>
-          <w:left w:val="none"/>
-          <w:bottom w:val="none"/>
-          <w:right w:val="none"/>
+          <w:left w:val="none" w:color="000000" w:sz="4" w:space="0"/>
+          <w:bottom w:val="none" w:color="000000" w:sz="4" w:space="0"/>
+          <w:right w:val="none" w:color="000000" w:sz="4" w:space="0"/>
         </w:tcBorders>
       </w:tcPr>
     </w:tblStylePr>
@@ -24035,9 +24064,9 @@
       </w:tcPr>
     </w:tblStylePr>
   </w:style>
-  <w:style w:type="table" w:styleId="113">
+  <w:style w:type="table" w:styleId="803">
     <w:name w:val="List Table 7 Colorful - Accent 3"/>
-    <w:basedOn w:val="11"/>
+    <w:basedOn w:val="701"/>
     <w:uiPriority w:val="99"/>
     <w:pPr>
       <w:pBdr/>
@@ -24136,11 +24165,11 @@
         <w:tblBorders/>
       </w:tblPr>
       <w:tcPr>
-        <w:shd w:color="ffffff"/>
+        <w:shd w:val="clear" w:color="ffffff"/>
         <w:tcBorders>
-          <w:top w:val="none"/>
-          <w:left w:val="none"/>
-          <w:bottom w:val="none"/>
+          <w:top w:val="none" w:color="000000" w:sz="4" w:space="0"/>
+          <w:left w:val="none" w:color="000000" w:sz="4" w:space="0"/>
+          <w:bottom w:val="none" w:color="000000" w:sz="4" w:space="0"/>
           <w:right w:val="single" w:color="000000" w:themeColor="accent3" w:themeTint="98" w:sz="4" w:space="0"/>
         </w:tcBorders>
       </w:tcPr>
@@ -24163,10 +24192,10 @@
       <w:tcPr>
         <w:shd w:val="clear" w:color="ffffff" w:themeColor="light1" w:fill="ffffff" w:themeFill="light1"/>
         <w:tcBorders>
-          <w:top w:val="none"/>
-          <w:left w:val="none"/>
+          <w:top w:val="none" w:color="000000" w:sz="4" w:space="0"/>
+          <w:left w:val="none" w:color="000000" w:sz="4" w:space="0"/>
           <w:bottom w:val="single" w:color="000000" w:themeColor="accent3" w:themeTint="98" w:sz="4" w:space="0"/>
-          <w:right w:val="none"/>
+          <w:right w:val="none" w:color="000000" w:sz="4" w:space="0"/>
         </w:tcBorders>
       </w:tcPr>
     </w:tblStylePr>
@@ -24186,12 +24215,12 @@
         <w:tblBorders/>
       </w:tblPr>
       <w:tcPr>
-        <w:shd w:color="ffffff"/>
+        <w:shd w:val="clear" w:color="ffffff"/>
         <w:tcBorders>
-          <w:top w:val="none"/>
+          <w:top w:val="none" w:color="000000" w:sz="4" w:space="0"/>
           <w:left w:val="single" w:color="000000" w:themeColor="accent3" w:themeTint="98" w:sz="4" w:space="0"/>
-          <w:bottom w:val="none"/>
-          <w:right w:val="none"/>
+          <w:bottom w:val="none" w:color="000000" w:sz="4" w:space="0"/>
+          <w:right w:val="none" w:color="000000" w:sz="4" w:space="0"/>
         </w:tcBorders>
       </w:tcPr>
     </w:tblStylePr>
@@ -24214,9 +24243,9 @@
         <w:shd w:val="clear" w:color="ffffff" w:themeColor="light1" w:fill="ffffff" w:themeFill="light1"/>
         <w:tcBorders>
           <w:top w:val="single" w:color="000000" w:themeColor="accent3" w:themeTint="98" w:sz="4" w:space="0"/>
-          <w:left w:val="none"/>
-          <w:bottom w:val="none"/>
-          <w:right w:val="none"/>
+          <w:left w:val="none" w:color="000000" w:sz="4" w:space="0"/>
+          <w:bottom w:val="none" w:color="000000" w:sz="4" w:space="0"/>
+          <w:right w:val="none" w:color="000000" w:sz="4" w:space="0"/>
         </w:tcBorders>
       </w:tcPr>
     </w:tblStylePr>
@@ -24291,9 +24320,9 @@
       </w:tcPr>
     </w:tblStylePr>
   </w:style>
-  <w:style w:type="table" w:styleId="114">
+  <w:style w:type="table" w:styleId="804">
     <w:name w:val="List Table 7 Colorful - Accent 4"/>
-    <w:basedOn w:val="11"/>
+    <w:basedOn w:val="701"/>
     <w:uiPriority w:val="99"/>
     <w:pPr>
       <w:pBdr/>
@@ -24392,11 +24421,11 @@
         <w:tblBorders/>
       </w:tblPr>
       <w:tcPr>
-        <w:shd w:color="ffffff"/>
+        <w:shd w:val="clear" w:color="ffffff"/>
         <w:tcBorders>
-          <w:top w:val="none"/>
-          <w:left w:val="none"/>
-          <w:bottom w:val="none"/>
+          <w:top w:val="none" w:color="000000" w:sz="4" w:space="0"/>
+          <w:left w:val="none" w:color="000000" w:sz="4" w:space="0"/>
+          <w:bottom w:val="none" w:color="000000" w:sz="4" w:space="0"/>
           <w:right w:val="single" w:color="000000" w:themeColor="accent4" w:themeTint="9A" w:sz="4" w:space="0"/>
         </w:tcBorders>
       </w:tcPr>
@@ -24419,10 +24448,10 @@
       <w:tcPr>
         <w:shd w:val="clear" w:color="ffffff" w:themeColor="light1" w:fill="ffffff" w:themeFill="light1"/>
         <w:tcBorders>
-          <w:top w:val="none"/>
-          <w:left w:val="none"/>
+          <w:top w:val="none" w:color="000000" w:sz="4" w:space="0"/>
+          <w:left w:val="none" w:color="000000" w:sz="4" w:space="0"/>
           <w:bottom w:val="single" w:color="000000" w:themeColor="accent4" w:themeTint="9A" w:sz="4" w:space="0"/>
-          <w:right w:val="none"/>
+          <w:right w:val="none" w:color="000000" w:sz="4" w:space="0"/>
         </w:tcBorders>
       </w:tcPr>
     </w:tblStylePr>
@@ -24442,12 +24471,12 @@
         <w:tblBorders/>
       </w:tblPr>
       <w:tcPr>
-        <w:shd w:color="ffffff"/>
+        <w:shd w:val="clear" w:color="ffffff"/>
         <w:tcBorders>
-          <w:top w:val="none"/>
+          <w:top w:val="none" w:color="000000" w:sz="4" w:space="0"/>
           <w:left w:val="single" w:color="000000" w:themeColor="accent4" w:themeTint="9A" w:sz="4" w:space="0"/>
-          <w:bottom w:val="none"/>
-          <w:right w:val="none"/>
+          <w:bottom w:val="none" w:color="000000" w:sz="4" w:space="0"/>
+          <w:right w:val="none" w:color="000000" w:sz="4" w:space="0"/>
         </w:tcBorders>
       </w:tcPr>
     </w:tblStylePr>
@@ -24470,9 +24499,9 @@
         <w:shd w:val="clear" w:color="ffffff" w:themeColor="light1" w:fill="ffffff" w:themeFill="light1"/>
         <w:tcBorders>
           <w:top w:val="single" w:color="000000" w:themeColor="accent4" w:themeTint="9A" w:sz="4" w:space="0"/>
-          <w:left w:val="none"/>
-          <w:bottom w:val="none"/>
-          <w:right w:val="none"/>
+          <w:left w:val="none" w:color="000000" w:sz="4" w:space="0"/>
+          <w:bottom w:val="none" w:color="000000" w:sz="4" w:space="0"/>
+          <w:right w:val="none" w:color="000000" w:sz="4" w:space="0"/>
         </w:tcBorders>
       </w:tcPr>
     </w:tblStylePr>
@@ -24547,9 +24576,9 @@
       </w:tcPr>
     </w:tblStylePr>
   </w:style>
-  <w:style w:type="table" w:styleId="115">
+  <w:style w:type="table" w:styleId="805">
     <w:name w:val="List Table 7 Colorful - Accent 5"/>
-    <w:basedOn w:val="11"/>
+    <w:basedOn w:val="701"/>
     <w:uiPriority w:val="99"/>
     <w:pPr>
       <w:pBdr/>
@@ -24648,11 +24677,11 @@
         <w:tblBorders/>
       </w:tblPr>
       <w:tcPr>
-        <w:shd w:color="ffffff"/>
+        <w:shd w:val="clear" w:color="ffffff"/>
         <w:tcBorders>
-          <w:top w:val="none"/>
-          <w:left w:val="none"/>
-          <w:bottom w:val="none"/>
+          <w:top w:val="none" w:color="000000" w:sz="4" w:space="0"/>
+          <w:left w:val="none" w:color="000000" w:sz="4" w:space="0"/>
+          <w:bottom w:val="none" w:color="000000" w:sz="4" w:space="0"/>
           <w:right w:val="single" w:color="000000" w:themeColor="accent5" w:themeTint="9A" w:sz="4" w:space="0"/>
         </w:tcBorders>
       </w:tcPr>
@@ -24675,10 +24704,10 @@
       <w:tcPr>
         <w:shd w:val="clear" w:color="ffffff" w:themeColor="light1" w:fill="ffffff" w:themeFill="light1"/>
         <w:tcBorders>
-          <w:top w:val="none"/>
-          <w:left w:val="none"/>
+          <w:top w:val="none" w:color="000000" w:sz="4" w:space="0"/>
+          <w:left w:val="none" w:color="000000" w:sz="4" w:space="0"/>
           <w:bottom w:val="single" w:color="000000" w:themeColor="accent5" w:themeTint="9A" w:sz="4" w:space="0"/>
-          <w:right w:val="none"/>
+          <w:right w:val="none" w:color="000000" w:sz="4" w:space="0"/>
         </w:tcBorders>
       </w:tcPr>
     </w:tblStylePr>
@@ -24698,12 +24727,12 @@
         <w:tblBorders/>
       </w:tblPr>
       <w:tcPr>
-        <w:shd w:color="ffffff"/>
+        <w:shd w:val="clear" w:color="ffffff"/>
         <w:tcBorders>
-          <w:top w:val="none"/>
+          <w:top w:val="none" w:color="000000" w:sz="4" w:space="0"/>
           <w:left w:val="single" w:color="000000" w:themeColor="accent5" w:themeTint="9A" w:sz="4" w:space="0"/>
-          <w:bottom w:val="none"/>
-          <w:right w:val="none"/>
+          <w:bottom w:val="none" w:color="000000" w:sz="4" w:space="0"/>
+          <w:right w:val="none" w:color="000000" w:sz="4" w:space="0"/>
         </w:tcBorders>
       </w:tcPr>
     </w:tblStylePr>
@@ -24726,9 +24755,9 @@
         <w:shd w:val="clear" w:color="ffffff" w:themeColor="light1" w:fill="ffffff" w:themeFill="light1"/>
         <w:tcBorders>
           <w:top w:val="single" w:color="000000" w:themeColor="accent5" w:themeTint="9A" w:sz="4" w:space="0"/>
-          <w:left w:val="none"/>
-          <w:bottom w:val="none"/>
-          <w:right w:val="none"/>
+          <w:left w:val="none" w:color="000000" w:sz="4" w:space="0"/>
+          <w:bottom w:val="none" w:color="000000" w:sz="4" w:space="0"/>
+          <w:right w:val="none" w:color="000000" w:sz="4" w:space="0"/>
         </w:tcBorders>
       </w:tcPr>
     </w:tblStylePr>
@@ -24803,9 +24832,9 @@
       </w:tcPr>
     </w:tblStylePr>
   </w:style>
-  <w:style w:type="table" w:styleId="116">
+  <w:style w:type="table" w:styleId="806">
     <w:name w:val="List Table 7 Colorful - Accent 6"/>
-    <w:basedOn w:val="11"/>
+    <w:basedOn w:val="701"/>
     <w:uiPriority w:val="99"/>
     <w:pPr>
       <w:pBdr/>
@@ -24904,11 +24933,11 @@
         <w:tblBorders/>
       </w:tblPr>
       <w:tcPr>
-        <w:shd w:color="ffffff"/>
+        <w:shd w:val="clear" w:color="ffffff"/>
         <w:tcBorders>
-          <w:top w:val="none"/>
-          <w:left w:val="none"/>
-          <w:bottom w:val="none"/>
+          <w:top w:val="none" w:color="000000" w:sz="4" w:space="0"/>
+          <w:left w:val="none" w:color="000000" w:sz="4" w:space="0"/>
+          <w:bottom w:val="none" w:color="000000" w:sz="4" w:space="0"/>
           <w:right w:val="single" w:color="000000" w:themeColor="accent6" w:themeTint="98" w:sz="4" w:space="0"/>
         </w:tcBorders>
       </w:tcPr>
@@ -24931,10 +24960,10 @@
       <w:tcPr>
         <w:shd w:val="clear" w:color="ffffff" w:themeColor="light1" w:fill="ffffff" w:themeFill="light1"/>
         <w:tcBorders>
-          <w:top w:val="none"/>
-          <w:left w:val="none"/>
+          <w:top w:val="none" w:color="000000" w:sz="4" w:space="0"/>
+          <w:left w:val="none" w:color="000000" w:sz="4" w:space="0"/>
           <w:bottom w:val="single" w:color="000000" w:themeColor="accent6" w:themeTint="98" w:sz="4" w:space="0"/>
-          <w:right w:val="none"/>
+          <w:right w:val="none" w:color="000000" w:sz="4" w:space="0"/>
         </w:tcBorders>
       </w:tcPr>
     </w:tblStylePr>
@@ -24954,12 +24983,12 @@
         <w:tblBorders/>
       </w:tblPr>
       <w:tcPr>
-        <w:shd w:color="ffffff"/>
+        <w:shd w:val="clear" w:color="ffffff"/>
         <w:tcBorders>
-          <w:top w:val="none"/>
+          <w:top w:val="none" w:color="000000" w:sz="4" w:space="0"/>
           <w:left w:val="single" w:color="000000" w:themeColor="accent6" w:themeTint="98" w:sz="4" w:space="0"/>
-          <w:bottom w:val="none"/>
-          <w:right w:val="none"/>
+          <w:bottom w:val="none" w:color="000000" w:sz="4" w:space="0"/>
+          <w:right w:val="none" w:color="000000" w:sz="4" w:space="0"/>
         </w:tcBorders>
       </w:tcPr>
     </w:tblStylePr>
@@ -24982,9 +25011,9 @@
         <w:shd w:val="clear" w:color="ffffff" w:themeColor="light1" w:fill="ffffff" w:themeFill="light1"/>
         <w:tcBorders>
           <w:top w:val="single" w:color="000000" w:themeColor="accent6" w:themeTint="98" w:sz="4" w:space="0"/>
-          <w:left w:val="none"/>
-          <w:bottom w:val="none"/>
-          <w:right w:val="none"/>
+          <w:left w:val="none" w:color="000000" w:sz="4" w:space="0"/>
+          <w:bottom w:val="none" w:color="000000" w:sz="4" w:space="0"/>
+          <w:right w:val="none" w:color="000000" w:sz="4" w:space="0"/>
         </w:tcBorders>
       </w:tcPr>
     </w:tblStylePr>
@@ -25059,9 +25088,9 @@
       </w:tcPr>
     </w:tblStylePr>
   </w:style>
-  <w:style w:type="table" w:styleId="117">
+  <w:style w:type="table" w:styleId="807">
     <w:name w:val="Lined - Accent"/>
-    <w:basedOn w:val="11"/>
+    <w:basedOn w:val="701"/>
     <w:uiPriority w:val="99"/>
     <w:pPr>
       <w:pBdr/>
@@ -25296,9 +25325,9 @@
       </w:tcPr>
     </w:tblStylePr>
   </w:style>
-  <w:style w:type="table" w:styleId="118">
+  <w:style w:type="table" w:styleId="808">
     <w:name w:val="Lined - Accent 1"/>
-    <w:basedOn w:val="11"/>
+    <w:basedOn w:val="701"/>
     <w:uiPriority w:val="99"/>
     <w:pPr>
       <w:pBdr/>
@@ -25533,9 +25562,9 @@
       </w:tcPr>
     </w:tblStylePr>
   </w:style>
-  <w:style w:type="table" w:styleId="119">
+  <w:style w:type="table" w:styleId="809">
     <w:name w:val="Lined - Accent 2"/>
-    <w:basedOn w:val="11"/>
+    <w:basedOn w:val="701"/>
     <w:uiPriority w:val="99"/>
     <w:pPr>
       <w:pBdr/>
@@ -25770,9 +25799,9 @@
       </w:tcPr>
     </w:tblStylePr>
   </w:style>
-  <w:style w:type="table" w:styleId="120">
+  <w:style w:type="table" w:styleId="810">
     <w:name w:val="Lined - Accent 3"/>
-    <w:basedOn w:val="11"/>
+    <w:basedOn w:val="701"/>
     <w:uiPriority w:val="99"/>
     <w:pPr>
       <w:pBdr/>
@@ -26007,9 +26036,9 @@
       </w:tcPr>
     </w:tblStylePr>
   </w:style>
-  <w:style w:type="table" w:styleId="121">
+  <w:style w:type="table" w:styleId="811">
     <w:name w:val="Lined - Accent 4"/>
-    <w:basedOn w:val="11"/>
+    <w:basedOn w:val="701"/>
     <w:uiPriority w:val="99"/>
     <w:pPr>
       <w:pBdr/>
@@ -26244,9 +26273,9 @@
       </w:tcPr>
     </w:tblStylePr>
   </w:style>
-  <w:style w:type="table" w:styleId="122">
+  <w:style w:type="table" w:styleId="812">
     <w:name w:val="Lined - Accent 5"/>
-    <w:basedOn w:val="11"/>
+    <w:basedOn w:val="701"/>
     <w:uiPriority w:val="99"/>
     <w:pPr>
       <w:pBdr/>
@@ -26481,9 +26510,9 @@
       </w:tcPr>
     </w:tblStylePr>
   </w:style>
-  <w:style w:type="table" w:styleId="123">
+  <w:style w:type="table" w:styleId="813">
     <w:name w:val="Lined - Accent 6"/>
-    <w:basedOn w:val="11"/>
+    <w:basedOn w:val="701"/>
     <w:uiPriority w:val="99"/>
     <w:pPr>
       <w:pBdr/>
@@ -26718,9 +26747,9 @@
       </w:tcPr>
     </w:tblStylePr>
   </w:style>
-  <w:style w:type="table" w:styleId="124">
+  <w:style w:type="table" w:styleId="814">
     <w:name w:val="Bordered &amp; Lined - Accent"/>
-    <w:basedOn w:val="11"/>
+    <w:basedOn w:val="701"/>
     <w:uiPriority w:val="99"/>
     <w:pPr>
       <w:pBdr/>
@@ -26962,9 +26991,9 @@
       </w:tcPr>
     </w:tblStylePr>
   </w:style>
-  <w:style w:type="table" w:styleId="125">
+  <w:style w:type="table" w:styleId="815">
     <w:name w:val="Bordered &amp; Lined - Accent 1"/>
-    <w:basedOn w:val="11"/>
+    <w:basedOn w:val="701"/>
     <w:uiPriority w:val="99"/>
     <w:pPr>
       <w:pBdr/>
@@ -27206,9 +27235,9 @@
       </w:tcPr>
     </w:tblStylePr>
   </w:style>
-  <w:style w:type="table" w:styleId="126">
+  <w:style w:type="table" w:styleId="816">
     <w:name w:val="Bordered &amp; Lined - Accent 2"/>
-    <w:basedOn w:val="11"/>
+    <w:basedOn w:val="701"/>
     <w:uiPriority w:val="99"/>
     <w:pPr>
       <w:pBdr/>
@@ -27450,9 +27479,9 @@
       </w:tcPr>
     </w:tblStylePr>
   </w:style>
-  <w:style w:type="table" w:styleId="127">
+  <w:style w:type="table" w:styleId="817">
     <w:name w:val="Bordered &amp; Lined - Accent 3"/>
-    <w:basedOn w:val="11"/>
+    <w:basedOn w:val="701"/>
     <w:uiPriority w:val="99"/>
     <w:pPr>
       <w:pBdr/>
@@ -27694,9 +27723,9 @@
       </w:tcPr>
     </w:tblStylePr>
   </w:style>
-  <w:style w:type="table" w:styleId="128">
+  <w:style w:type="table" w:styleId="818">
     <w:name w:val="Bordered &amp; Lined - Accent 4"/>
-    <w:basedOn w:val="11"/>
+    <w:basedOn w:val="701"/>
     <w:uiPriority w:val="99"/>
     <w:pPr>
       <w:pBdr/>
@@ -27938,9 +27967,9 @@
       </w:tcPr>
     </w:tblStylePr>
   </w:style>
-  <w:style w:type="table" w:styleId="129">
+  <w:style w:type="table" w:styleId="819">
     <w:name w:val="Bordered &amp; Lined - Accent 5"/>
-    <w:basedOn w:val="11"/>
+    <w:basedOn w:val="701"/>
     <w:uiPriority w:val="99"/>
     <w:pPr>
       <w:pBdr/>
@@ -28182,9 +28211,9 @@
       </w:tcPr>
     </w:tblStylePr>
   </w:style>
-  <w:style w:type="table" w:styleId="130">
+  <w:style w:type="table" w:styleId="820">
     <w:name w:val="Bordered &amp; Lined - Accent 6"/>
-    <w:basedOn w:val="11"/>
+    <w:basedOn w:val="701"/>
     <w:uiPriority w:val="99"/>
     <w:pPr>
       <w:pBdr/>
@@ -28426,9 +28455,9 @@
       </w:tcPr>
     </w:tblStylePr>
   </w:style>
-  <w:style w:type="table" w:styleId="131">
+  <w:style w:type="table" w:styleId="821">
     <w:name w:val="Bordered"/>
-    <w:basedOn w:val="11"/>
+    <w:basedOn w:val="701"/>
     <w:uiPriority w:val="99"/>
     <w:pPr>
       <w:pBdr/>
@@ -28657,9 +28686,9 @@
       </w:tcPr>
     </w:tblStylePr>
   </w:style>
-  <w:style w:type="table" w:styleId="132">
+  <w:style w:type="table" w:styleId="822">
     <w:name w:val="Bordered - Accent 1"/>
-    <w:basedOn w:val="11"/>
+    <w:basedOn w:val="701"/>
     <w:uiPriority w:val="99"/>
     <w:pPr>
       <w:pBdr/>
@@ -28888,9 +28917,9 @@
       </w:tcPr>
     </w:tblStylePr>
   </w:style>
-  <w:style w:type="table" w:styleId="133">
+  <w:style w:type="table" w:styleId="823">
     <w:name w:val="Bordered - Accent 2"/>
-    <w:basedOn w:val="11"/>
+    <w:basedOn w:val="701"/>
     <w:uiPriority w:val="99"/>
     <w:pPr>
       <w:pBdr/>
@@ -29119,9 +29148,9 @@
       </w:tcPr>
     </w:tblStylePr>
   </w:style>
-  <w:style w:type="table" w:styleId="134">
+  <w:style w:type="table" w:styleId="824">
     <w:name w:val="Bordered - Accent 3"/>
-    <w:basedOn w:val="11"/>
+    <w:basedOn w:val="701"/>
     <w:uiPriority w:val="99"/>
     <w:pPr>
       <w:pBdr/>
@@ -29350,9 +29379,9 @@
       </w:tcPr>
     </w:tblStylePr>
   </w:style>
-  <w:style w:type="table" w:styleId="135">
+  <w:style w:type="table" w:styleId="825">
     <w:name w:val="Bordered - Accent 4"/>
-    <w:basedOn w:val="11"/>
+    <w:basedOn w:val="701"/>
     <w:uiPriority w:val="99"/>
     <w:pPr>
       <w:pBdr/>
@@ -29581,9 +29610,9 @@
       </w:tcPr>
     </w:tblStylePr>
   </w:style>
-  <w:style w:type="table" w:styleId="136">
+  <w:style w:type="table" w:styleId="826">
     <w:name w:val="Bordered - Accent 5"/>
-    <w:basedOn w:val="11"/>
+    <w:basedOn w:val="701"/>
     <w:uiPriority w:val="99"/>
     <w:pPr>
       <w:pBdr/>
@@ -29812,9 +29841,9 @@
       </w:tcPr>
     </w:tblStylePr>
   </w:style>
-  <w:style w:type="table" w:styleId="137">
+  <w:style w:type="table" w:styleId="827">
     <w:name w:val="Bordered - Accent 6"/>
-    <w:basedOn w:val="11"/>
+    <w:basedOn w:val="701"/>
     <w:uiPriority w:val="99"/>
     <w:pPr>
       <w:pBdr/>
@@ -30043,7 +30072,7 @@
       </w:tcPr>
     </w:tblStylePr>
   </w:style>
-  <w:style w:type="paragraph" w:styleId="138" w:default="1">
+  <w:style w:type="paragraph" w:styleId="828" w:default="1">
     <w:name w:val="Normal"/>
     <w:qFormat/>
     <w:pPr>
@@ -30052,11 +30081,11 @@
       <w:ind/>
     </w:pPr>
   </w:style>
-  <w:style w:type="paragraph" w:styleId="139">
+  <w:style w:type="paragraph" w:styleId="829">
     <w:name w:val="Heading 1"/>
-    <w:basedOn w:val="138"/>
-    <w:next w:val="138"/>
-    <w:link w:val="150"/>
+    <w:basedOn w:val="828"/>
+    <w:next w:val="828"/>
+    <w:link w:val="840"/>
     <w:uiPriority w:val="9"/>
     <w:qFormat/>
     <w:pPr>
@@ -30074,11 +30103,11 @@
       <w:szCs w:val="40"/>
     </w:rPr>
   </w:style>
-  <w:style w:type="paragraph" w:styleId="140">
+  <w:style w:type="paragraph" w:styleId="830">
     <w:name w:val="Heading 2"/>
-    <w:basedOn w:val="138"/>
-    <w:next w:val="138"/>
-    <w:link w:val="151"/>
+    <w:basedOn w:val="828"/>
+    <w:next w:val="828"/>
+    <w:link w:val="841"/>
     <w:uiPriority w:val="9"/>
     <w:unhideWhenUsed/>
     <w:qFormat/>
@@ -30097,11 +30126,11 @@
       <w:szCs w:val="32"/>
     </w:rPr>
   </w:style>
-  <w:style w:type="paragraph" w:styleId="141">
+  <w:style w:type="paragraph" w:styleId="831">
     <w:name w:val="Heading 3"/>
-    <w:basedOn w:val="138"/>
-    <w:next w:val="138"/>
-    <w:link w:val="152"/>
+    <w:basedOn w:val="828"/>
+    <w:next w:val="828"/>
+    <w:link w:val="842"/>
     <w:uiPriority w:val="9"/>
     <w:unhideWhenUsed/>
     <w:qFormat/>
@@ -30120,11 +30149,11 @@
       <w:szCs w:val="28"/>
     </w:rPr>
   </w:style>
-  <w:style w:type="paragraph" w:styleId="142">
+  <w:style w:type="paragraph" w:styleId="832">
     <w:name w:val="Heading 4"/>
-    <w:basedOn w:val="138"/>
-    <w:next w:val="138"/>
-    <w:link w:val="153"/>
+    <w:basedOn w:val="828"/>
+    <w:next w:val="828"/>
+    <w:link w:val="843"/>
     <w:uiPriority w:val="9"/>
     <w:unhideWhenUsed/>
     <w:qFormat/>
@@ -30143,11 +30172,11 @@
       <w:color w:val="0f4761" w:themeColor="accent1" w:themeShade="BF"/>
     </w:rPr>
   </w:style>
-  <w:style w:type="paragraph" w:styleId="143">
+  <w:style w:type="paragraph" w:styleId="833">
     <w:name w:val="Heading 5"/>
-    <w:basedOn w:val="138"/>
-    <w:next w:val="138"/>
-    <w:link w:val="154"/>
+    <w:basedOn w:val="828"/>
+    <w:next w:val="828"/>
+    <w:link w:val="844"/>
     <w:uiPriority w:val="9"/>
     <w:unhideWhenUsed/>
     <w:qFormat/>
@@ -30164,11 +30193,11 @@
       <w:color w:val="0f4761" w:themeColor="accent1" w:themeShade="BF"/>
     </w:rPr>
   </w:style>
-  <w:style w:type="paragraph" w:styleId="144">
+  <w:style w:type="paragraph" w:styleId="834">
     <w:name w:val="Heading 6"/>
-    <w:basedOn w:val="138"/>
-    <w:next w:val="138"/>
-    <w:link w:val="155"/>
+    <w:basedOn w:val="828"/>
+    <w:next w:val="828"/>
+    <w:link w:val="845"/>
     <w:uiPriority w:val="9"/>
     <w:unhideWhenUsed/>
     <w:qFormat/>
@@ -30187,11 +30216,11 @@
       <w:color w:val="595959" w:themeColor="text1" w:themeTint="A6"/>
     </w:rPr>
   </w:style>
-  <w:style w:type="paragraph" w:styleId="145">
+  <w:style w:type="paragraph" w:styleId="835">
     <w:name w:val="Heading 7"/>
-    <w:basedOn w:val="138"/>
-    <w:next w:val="138"/>
-    <w:link w:val="156"/>
+    <w:basedOn w:val="828"/>
+    <w:next w:val="828"/>
+    <w:link w:val="846"/>
     <w:uiPriority w:val="9"/>
     <w:unhideWhenUsed/>
     <w:qFormat/>
@@ -30208,11 +30237,11 @@
       <w:color w:val="595959" w:themeColor="text1" w:themeTint="A6"/>
     </w:rPr>
   </w:style>
-  <w:style w:type="paragraph" w:styleId="146">
+  <w:style w:type="paragraph" w:styleId="836">
     <w:name w:val="Heading 8"/>
-    <w:basedOn w:val="138"/>
-    <w:next w:val="138"/>
-    <w:link w:val="157"/>
+    <w:basedOn w:val="828"/>
+    <w:next w:val="828"/>
+    <w:link w:val="847"/>
     <w:uiPriority w:val="9"/>
     <w:unhideWhenUsed/>
     <w:qFormat/>
@@ -30231,11 +30260,11 @@
       <w:color w:val="272727" w:themeColor="text1" w:themeTint="D8"/>
     </w:rPr>
   </w:style>
-  <w:style w:type="paragraph" w:styleId="147">
+  <w:style w:type="paragraph" w:styleId="837">
     <w:name w:val="Heading 9"/>
-    <w:basedOn w:val="138"/>
-    <w:next w:val="138"/>
-    <w:link w:val="158"/>
+    <w:basedOn w:val="828"/>
+    <w:next w:val="828"/>
+    <w:link w:val="848"/>
     <w:uiPriority w:val="9"/>
     <w:unhideWhenUsed/>
     <w:qFormat/>
@@ -30254,7 +30283,7 @@
       <w:color w:val="272727" w:themeColor="text1" w:themeTint="D8"/>
     </w:rPr>
   </w:style>
-  <w:style w:type="character" w:styleId="148" w:default="1">
+  <w:style w:type="character" w:styleId="838" w:default="1">
     <w:name w:val="Default Paragraph Font"/>
     <w:uiPriority w:val="1"/>
     <w:semiHidden/>
@@ -30265,7 +30294,7 @@
       <w:ind/>
     </w:pPr>
   </w:style>
-  <w:style w:type="numbering" w:styleId="149" w:default="1">
+  <w:style w:type="numbering" w:styleId="839" w:default="1">
     <w:name w:val="No List"/>
     <w:uiPriority w:val="99"/>
     <w:semiHidden/>
@@ -30276,10 +30305,10 @@
       <w:ind/>
     </w:pPr>
   </w:style>
-  <w:style w:type="character" w:styleId="150">
+  <w:style w:type="character" w:styleId="840">
     <w:name w:val="Heading 1 Char"/>
-    <w:basedOn w:val="148"/>
-    <w:link w:val="139"/>
+    <w:basedOn w:val="838"/>
+    <w:link w:val="829"/>
     <w:uiPriority w:val="9"/>
     <w:pPr>
       <w:pBdr/>
@@ -30293,10 +30322,10 @@
       <w:szCs w:val="40"/>
     </w:rPr>
   </w:style>
-  <w:style w:type="character" w:styleId="151">
+  <w:style w:type="character" w:styleId="841">
     <w:name w:val="Heading 2 Char"/>
-    <w:basedOn w:val="148"/>
-    <w:link w:val="140"/>
+    <w:basedOn w:val="838"/>
+    <w:link w:val="830"/>
     <w:uiPriority w:val="9"/>
     <w:pPr>
       <w:pBdr/>
@@ -30310,10 +30339,10 @@
       <w:szCs w:val="32"/>
     </w:rPr>
   </w:style>
-  <w:style w:type="character" w:styleId="152">
+  <w:style w:type="character" w:styleId="842">
     <w:name w:val="Heading 3 Char"/>
-    <w:basedOn w:val="148"/>
-    <w:link w:val="141"/>
+    <w:basedOn w:val="838"/>
+    <w:link w:val="831"/>
     <w:uiPriority w:val="9"/>
     <w:pPr>
       <w:pBdr/>
@@ -30327,10 +30356,10 @@
       <w:szCs w:val="28"/>
     </w:rPr>
   </w:style>
-  <w:style w:type="character" w:styleId="153">
+  <w:style w:type="character" w:styleId="843">
     <w:name w:val="Heading 4 Char"/>
-    <w:basedOn w:val="148"/>
-    <w:link w:val="142"/>
+    <w:basedOn w:val="838"/>
+    <w:link w:val="832"/>
     <w:uiPriority w:val="9"/>
     <w:pPr>
       <w:pBdr/>
@@ -30344,10 +30373,10 @@
       <w:color w:val="0f4761" w:themeColor="accent1" w:themeShade="BF"/>
     </w:rPr>
   </w:style>
-  <w:style w:type="character" w:styleId="154">
+  <w:style w:type="character" w:styleId="844">
     <w:name w:val="Heading 5 Char"/>
-    <w:basedOn w:val="148"/>
-    <w:link w:val="143"/>
+    <w:basedOn w:val="838"/>
+    <w:link w:val="833"/>
     <w:uiPriority w:val="9"/>
     <w:pPr>
       <w:pBdr/>
@@ -30359,10 +30388,10 @@
       <w:color w:val="0f4761" w:themeColor="accent1" w:themeShade="BF"/>
     </w:rPr>
   </w:style>
-  <w:style w:type="character" w:styleId="155">
+  <w:style w:type="character" w:styleId="845">
     <w:name w:val="Heading 6 Char"/>
-    <w:basedOn w:val="148"/>
-    <w:link w:val="144"/>
+    <w:basedOn w:val="838"/>
+    <w:link w:val="834"/>
     <w:uiPriority w:val="9"/>
     <w:pPr>
       <w:pBdr/>
@@ -30376,10 +30405,10 @@
       <w:color w:val="595959" w:themeColor="text1" w:themeTint="A6"/>
     </w:rPr>
   </w:style>
-  <w:style w:type="character" w:styleId="156">
+  <w:style w:type="character" w:styleId="846">
     <w:name w:val="Heading 7 Char"/>
-    <w:basedOn w:val="148"/>
-    <w:link w:val="145"/>
+    <w:basedOn w:val="838"/>
+    <w:link w:val="835"/>
     <w:uiPriority w:val="9"/>
     <w:pPr>
       <w:pBdr/>
@@ -30391,10 +30420,10 @@
       <w:color w:val="595959" w:themeColor="text1" w:themeTint="A6"/>
     </w:rPr>
   </w:style>
-  <w:style w:type="character" w:styleId="157">
+  <w:style w:type="character" w:styleId="847">
     <w:name w:val="Heading 8 Char"/>
-    <w:basedOn w:val="148"/>
-    <w:link w:val="146"/>
+    <w:basedOn w:val="838"/>
+    <w:link w:val="836"/>
     <w:uiPriority w:val="9"/>
     <w:pPr>
       <w:pBdr/>
@@ -30408,10 +30437,10 @@
       <w:color w:val="272727" w:themeColor="text1" w:themeTint="D8"/>
     </w:rPr>
   </w:style>
-  <w:style w:type="character" w:styleId="158">
+  <w:style w:type="character" w:styleId="848">
     <w:name w:val="Heading 9 Char"/>
-    <w:basedOn w:val="148"/>
-    <w:link w:val="147"/>
+    <w:basedOn w:val="838"/>
+    <w:link w:val="837"/>
     <w:uiPriority w:val="9"/>
     <w:pPr>
       <w:pBdr/>
@@ -30425,11 +30454,11 @@
       <w:color w:val="272727" w:themeColor="text1" w:themeTint="D8"/>
     </w:rPr>
   </w:style>
-  <w:style w:type="paragraph" w:styleId="159">
+  <w:style w:type="paragraph" w:styleId="849">
     <w:name w:val="Title"/>
-    <w:basedOn w:val="138"/>
-    <w:next w:val="138"/>
-    <w:link w:val="160"/>
+    <w:basedOn w:val="828"/>
+    <w:next w:val="828"/>
+    <w:link w:val="850"/>
     <w:uiPriority w:val="10"/>
     <w:qFormat/>
     <w:pPr>
@@ -30445,10 +30474,10 @@
       <w:szCs w:val="56"/>
     </w:rPr>
   </w:style>
-  <w:style w:type="character" w:styleId="160">
+  <w:style w:type="character" w:styleId="850">
     <w:name w:val="Title Char"/>
-    <w:basedOn w:val="148"/>
-    <w:link w:val="159"/>
+    <w:basedOn w:val="838"/>
+    <w:link w:val="849"/>
     <w:uiPriority w:val="10"/>
     <w:pPr>
       <w:pBdr/>
@@ -30462,11 +30491,11 @@
       <w:szCs w:val="56"/>
     </w:rPr>
   </w:style>
-  <w:style w:type="paragraph" w:styleId="161">
+  <w:style w:type="paragraph" w:styleId="851">
     <w:name w:val="Subtitle"/>
-    <w:basedOn w:val="138"/>
-    <w:next w:val="138"/>
-    <w:link w:val="162"/>
+    <w:basedOn w:val="828"/>
+    <w:next w:val="828"/>
+    <w:link w:val="852"/>
     <w:uiPriority w:val="11"/>
     <w:qFormat/>
     <w:pPr>
@@ -30484,10 +30513,10 @@
       <w:szCs w:val="28"/>
     </w:rPr>
   </w:style>
-  <w:style w:type="character" w:styleId="162">
+  <w:style w:type="character" w:styleId="852">
     <w:name w:val="Subtitle Char"/>
-    <w:basedOn w:val="148"/>
-    <w:link w:val="161"/>
+    <w:basedOn w:val="838"/>
+    <w:link w:val="851"/>
     <w:uiPriority w:val="11"/>
     <w:pPr>
       <w:pBdr/>
@@ -30501,11 +30530,11 @@
       <w:szCs w:val="28"/>
     </w:rPr>
   </w:style>
-  <w:style w:type="paragraph" w:styleId="163">
+  <w:style w:type="paragraph" w:styleId="853">
     <w:name w:val="Quote"/>
-    <w:basedOn w:val="138"/>
-    <w:next w:val="138"/>
-    <w:link w:val="164"/>
+    <w:basedOn w:val="828"/>
+    <w:next w:val="828"/>
+    <w:link w:val="854"/>
     <w:uiPriority w:val="29"/>
     <w:qFormat/>
     <w:pPr>
@@ -30520,10 +30549,10 @@
       <w:color w:val="404040" w:themeColor="text1" w:themeTint="BF"/>
     </w:rPr>
   </w:style>
-  <w:style w:type="character" w:styleId="164">
+  <w:style w:type="character" w:styleId="854">
     <w:name w:val="Quote Char"/>
-    <w:basedOn w:val="148"/>
-    <w:link w:val="163"/>
+    <w:basedOn w:val="838"/>
+    <w:link w:val="853"/>
     <w:uiPriority w:val="29"/>
     <w:pPr>
       <w:pBdr/>
@@ -30536,9 +30565,9 @@
       <w:color w:val="404040" w:themeColor="text1" w:themeTint="BF"/>
     </w:rPr>
   </w:style>
-  <w:style w:type="paragraph" w:styleId="165">
+  <w:style w:type="paragraph" w:styleId="855">
     <w:name w:val="List Paragraph"/>
-    <w:basedOn w:val="138"/>
+    <w:basedOn w:val="828"/>
     <w:uiPriority w:val="34"/>
     <w:qFormat/>
     <w:pPr>
@@ -30548,9 +30577,9 @@
       <w:contextualSpacing w:val="true"/>
     </w:pPr>
   </w:style>
-  <w:style w:type="character" w:styleId="166">
+  <w:style w:type="character" w:styleId="856">
     <w:name w:val="Intense Emphasis"/>
-    <w:basedOn w:val="148"/>
+    <w:basedOn w:val="838"/>
     <w:uiPriority w:val="21"/>
     <w:qFormat/>
     <w:pPr>
@@ -30564,11 +30593,11 @@
       <w:color w:val="0f4761" w:themeColor="accent1" w:themeShade="BF"/>
     </w:rPr>
   </w:style>
-  <w:style w:type="paragraph" w:styleId="167">
+  <w:style w:type="paragraph" w:styleId="857">
     <w:name w:val="Intense Quote"/>
-    <w:basedOn w:val="138"/>
-    <w:next w:val="138"/>
-    <w:link w:val="168"/>
+    <w:basedOn w:val="828"/>
+    <w:next w:val="828"/>
+    <w:link w:val="858"/>
     <w:uiPriority w:val="30"/>
     <w:qFormat/>
     <w:pPr>
@@ -30586,10 +30615,10 @@
       <w:color w:val="0f4761" w:themeColor="accent1" w:themeShade="BF"/>
     </w:rPr>
   </w:style>
-  <w:style w:type="character" w:styleId="168">
+  <w:style w:type="character" w:styleId="858">
     <w:name w:val="Intense Quote Char"/>
-    <w:basedOn w:val="148"/>
-    <w:link w:val="167"/>
+    <w:basedOn w:val="838"/>
+    <w:link w:val="857"/>
     <w:uiPriority w:val="30"/>
     <w:pPr>
       <w:pBdr/>
@@ -30602,9 +30631,9 @@
       <w:color w:val="0f4761" w:themeColor="accent1" w:themeShade="BF"/>
     </w:rPr>
   </w:style>
-  <w:style w:type="character" w:styleId="169">
+  <w:style w:type="character" w:styleId="859">
     <w:name w:val="Intense Reference"/>
-    <w:basedOn w:val="148"/>
+    <w:basedOn w:val="838"/>
     <w:uiPriority w:val="32"/>
     <w:qFormat/>
     <w:pPr>
@@ -30620,9 +30649,9 @@
       <w:spacing w:val="5"/>
     </w:rPr>
   </w:style>
-  <w:style w:type="paragraph" w:styleId="170">
+  <w:style w:type="paragraph" w:styleId="860">
     <w:name w:val="No Spacing"/>
-    <w:basedOn w:val="138"/>
+    <w:basedOn w:val="828"/>
     <w:uiPriority w:val="1"/>
     <w:qFormat/>
     <w:pPr>
@@ -30631,9 +30660,9 @@
       <w:ind/>
     </w:pPr>
   </w:style>
-  <w:style w:type="character" w:styleId="171">
+  <w:style w:type="character" w:styleId="861">
     <w:name w:val="Subtle Emphasis"/>
-    <w:basedOn w:val="148"/>
+    <w:basedOn w:val="838"/>
     <w:uiPriority w:val="19"/>
     <w:qFormat/>
     <w:pPr>
@@ -30647,9 +30676,9 @@
       <w:color w:val="404040" w:themeColor="text1" w:themeTint="BF"/>
     </w:rPr>
   </w:style>
-  <w:style w:type="character" w:styleId="172">
+  <w:style w:type="character" w:styleId="862">
     <w:name w:val="Emphasis"/>
-    <w:basedOn w:val="148"/>
+    <w:basedOn w:val="838"/>
     <w:uiPriority w:val="20"/>
     <w:qFormat/>
     <w:pPr>
@@ -30662,9 +30691,9 @@
       <w:iCs/>
     </w:rPr>
   </w:style>
-  <w:style w:type="character" w:styleId="173">
+  <w:style w:type="character" w:styleId="863">
     <w:name w:val="Strong"/>
-    <w:basedOn w:val="148"/>
+    <w:basedOn w:val="838"/>
     <w:uiPriority w:val="22"/>
     <w:qFormat/>
     <w:pPr>
@@ -30677,9 +30706,9 @@
       <w:bCs/>
     </w:rPr>
   </w:style>
-  <w:style w:type="character" w:styleId="174">
+  <w:style w:type="character" w:styleId="864">
     <w:name w:val="Subtle Reference"/>
-    <w:basedOn w:val="148"/>
+    <w:basedOn w:val="838"/>
     <w:uiPriority w:val="31"/>
     <w:qFormat/>
     <w:pPr>
@@ -30692,9 +30721,9 @@
       <w:color w:val="5a5a5a" w:themeColor="text1" w:themeTint="A5"/>
     </w:rPr>
   </w:style>
-  <w:style w:type="character" w:styleId="175">
+  <w:style w:type="character" w:styleId="865">
     <w:name w:val="Book Title"/>
-    <w:basedOn w:val="148"/>
+    <w:basedOn w:val="838"/>
     <w:uiPriority w:val="33"/>
     <w:qFormat/>
     <w:pPr>
@@ -30710,10 +30739,10 @@
       <w:spacing w:val="5"/>
     </w:rPr>
   </w:style>
-  <w:style w:type="paragraph" w:styleId="176">
+  <w:style w:type="paragraph" w:styleId="866">
     <w:name w:val="Header"/>
-    <w:basedOn w:val="138"/>
-    <w:link w:val="177"/>
+    <w:basedOn w:val="828"/>
+    <w:link w:val="867"/>
     <w:uiPriority w:val="99"/>
     <w:unhideWhenUsed/>
     <w:pPr>
@@ -30726,10 +30755,10 @@
       <w:ind/>
     </w:pPr>
   </w:style>
-  <w:style w:type="character" w:styleId="177">
+  <w:style w:type="character" w:styleId="867">
     <w:name w:val="Header Char"/>
-    <w:basedOn w:val="148"/>
-    <w:link w:val="176"/>
+    <w:basedOn w:val="838"/>
+    <w:link w:val="866"/>
     <w:uiPriority w:val="99"/>
     <w:pPr>
       <w:pBdr/>
@@ -30737,10 +30766,10 @@
       <w:ind/>
     </w:pPr>
   </w:style>
-  <w:style w:type="paragraph" w:styleId="178">
+  <w:style w:type="paragraph" w:styleId="868">
     <w:name w:val="Footer"/>
-    <w:basedOn w:val="138"/>
-    <w:link w:val="179"/>
+    <w:basedOn w:val="828"/>
+    <w:link w:val="869"/>
     <w:uiPriority w:val="99"/>
     <w:unhideWhenUsed/>
     <w:pPr>
@@ -30753,10 +30782,10 @@
       <w:ind/>
     </w:pPr>
   </w:style>
-  <w:style w:type="character" w:styleId="179">
+  <w:style w:type="character" w:styleId="869">
     <w:name w:val="Footer Char"/>
-    <w:basedOn w:val="148"/>
-    <w:link w:val="178"/>
+    <w:basedOn w:val="838"/>
+    <w:link w:val="868"/>
     <w:uiPriority w:val="99"/>
     <w:pPr>
       <w:pBdr/>
@@ -30764,10 +30793,10 @@
       <w:ind/>
     </w:pPr>
   </w:style>
-  <w:style w:type="paragraph" w:styleId="180">
+  <w:style w:type="paragraph" w:styleId="870">
     <w:name w:val="Caption"/>
-    <w:basedOn w:val="138"/>
-    <w:next w:val="138"/>
+    <w:basedOn w:val="828"/>
+    <w:next w:val="828"/>
     <w:uiPriority w:val="35"/>
     <w:unhideWhenUsed/>
     <w:qFormat/>
@@ -30784,10 +30813,10 @@
       <w:szCs w:val="18"/>
     </w:rPr>
   </w:style>
-  <w:style w:type="paragraph" w:styleId="181">
+  <w:style w:type="paragraph" w:styleId="871">
     <w:name w:val="footnote text"/>
-    <w:basedOn w:val="138"/>
-    <w:link w:val="182"/>
+    <w:basedOn w:val="828"/>
+    <w:link w:val="872"/>
     <w:uiPriority w:val="99"/>
     <w:semiHidden/>
     <w:unhideWhenUsed/>
@@ -30801,10 +30830,10 @@
       <w:szCs w:val="20"/>
     </w:rPr>
   </w:style>
-  <w:style w:type="character" w:styleId="182">
+  <w:style w:type="character" w:styleId="872">
     <w:name w:val="Footnote Text Char"/>
-    <w:basedOn w:val="148"/>
-    <w:link w:val="181"/>
+    <w:basedOn w:val="838"/>
+    <w:link w:val="871"/>
     <w:uiPriority w:val="99"/>
     <w:semiHidden/>
     <w:pPr>
@@ -30817,9 +30846,9 @@
       <w:szCs w:val="20"/>
     </w:rPr>
   </w:style>
-  <w:style w:type="character" w:styleId="183">
+  <w:style w:type="character" w:styleId="873">
     <w:name w:val="footnote reference"/>
-    <w:basedOn w:val="148"/>
+    <w:basedOn w:val="838"/>
     <w:uiPriority w:val="99"/>
     <w:semiHidden/>
     <w:unhideWhenUsed/>
@@ -30832,10 +30861,10 @@
       <w:vertAlign w:val="superscript"/>
     </w:rPr>
   </w:style>
-  <w:style w:type="paragraph" w:styleId="184">
+  <w:style w:type="paragraph" w:styleId="874">
     <w:name w:val="endnote text"/>
-    <w:basedOn w:val="138"/>
-    <w:link w:val="185"/>
+    <w:basedOn w:val="828"/>
+    <w:link w:val="875"/>
     <w:uiPriority w:val="99"/>
     <w:semiHidden/>
     <w:unhideWhenUsed/>
@@ -30849,10 +30878,10 @@
       <w:szCs w:val="20"/>
     </w:rPr>
   </w:style>
-  <w:style w:type="character" w:styleId="185">
+  <w:style w:type="character" w:styleId="875">
     <w:name w:val="Endnote Text Char"/>
-    <w:basedOn w:val="148"/>
-    <w:link w:val="184"/>
+    <w:basedOn w:val="838"/>
+    <w:link w:val="874"/>
     <w:uiPriority w:val="99"/>
     <w:semiHidden/>
     <w:pPr>
@@ -30865,9 +30894,9 @@
       <w:szCs w:val="20"/>
     </w:rPr>
   </w:style>
-  <w:style w:type="character" w:styleId="186">
+  <w:style w:type="character" w:styleId="876">
     <w:name w:val="endnote reference"/>
-    <w:basedOn w:val="148"/>
+    <w:basedOn w:val="838"/>
     <w:uiPriority w:val="99"/>
     <w:semiHidden/>
     <w:unhideWhenUsed/>
@@ -30880,9 +30909,9 @@
       <w:vertAlign w:val="superscript"/>
     </w:rPr>
   </w:style>
-  <w:style w:type="character" w:styleId="187">
+  <w:style w:type="character" w:styleId="877">
     <w:name w:val="Hyperlink"/>
-    <w:basedOn w:val="148"/>
+    <w:basedOn w:val="838"/>
     <w:uiPriority w:val="99"/>
     <w:unhideWhenUsed/>
     <w:pPr>
@@ -30895,9 +30924,9 @@
       <w:u w:val="single"/>
     </w:rPr>
   </w:style>
-  <w:style w:type="character" w:styleId="188">
+  <w:style w:type="character" w:styleId="878">
     <w:name w:val="FollowedHyperlink"/>
-    <w:basedOn w:val="148"/>
+    <w:basedOn w:val="838"/>
     <w:uiPriority w:val="99"/>
     <w:semiHidden/>
     <w:unhideWhenUsed/>
@@ -30911,10 +30940,10 @@
       <w:u w:val="single"/>
     </w:rPr>
   </w:style>
-  <w:style w:type="paragraph" w:styleId="189">
+  <w:style w:type="paragraph" w:styleId="879">
     <w:name w:val="toc 1"/>
-    <w:basedOn w:val="138"/>
-    <w:next w:val="138"/>
+    <w:basedOn w:val="828"/>
+    <w:next w:val="828"/>
     <w:uiPriority w:val="39"/>
     <w:unhideWhenUsed/>
     <w:pPr>
@@ -30923,10 +30952,10 @@
       <w:ind/>
     </w:pPr>
   </w:style>
-  <w:style w:type="paragraph" w:styleId="190">
+  <w:style w:type="paragraph" w:styleId="880">
     <w:name w:val="toc 2"/>
-    <w:basedOn w:val="138"/>
-    <w:next w:val="138"/>
+    <w:basedOn w:val="828"/>
+    <w:next w:val="828"/>
     <w:uiPriority w:val="39"/>
     <w:unhideWhenUsed/>
     <w:pPr>
@@ -30935,10 +30964,10 @@
       <w:ind w:left="220"/>
     </w:pPr>
   </w:style>
-  <w:style w:type="paragraph" w:styleId="191">
+  <w:style w:type="paragraph" w:styleId="881">
     <w:name w:val="toc 3"/>
-    <w:basedOn w:val="138"/>
-    <w:next w:val="138"/>
+    <w:basedOn w:val="828"/>
+    <w:next w:val="828"/>
     <w:uiPriority w:val="39"/>
     <w:unhideWhenUsed/>
     <w:pPr>
@@ -30947,10 +30976,10 @@
       <w:ind w:left="440"/>
     </w:pPr>
   </w:style>
-  <w:style w:type="paragraph" w:styleId="192">
+  <w:style w:type="paragraph" w:styleId="882">
     <w:name w:val="toc 4"/>
-    <w:basedOn w:val="138"/>
-    <w:next w:val="138"/>
+    <w:basedOn w:val="828"/>
+    <w:next w:val="828"/>
     <w:uiPriority w:val="39"/>
     <w:unhideWhenUsed/>
     <w:pPr>
@@ -30959,10 +30988,10 @@
       <w:ind w:left="660"/>
     </w:pPr>
   </w:style>
-  <w:style w:type="paragraph" w:styleId="193">
+  <w:style w:type="paragraph" w:styleId="883">
     <w:name w:val="toc 5"/>
-    <w:basedOn w:val="138"/>
-    <w:next w:val="138"/>
+    <w:basedOn w:val="828"/>
+    <w:next w:val="828"/>
     <w:uiPriority w:val="39"/>
     <w:unhideWhenUsed/>
     <w:pPr>
@@ -30971,10 +31000,10 @@
       <w:ind w:left="880"/>
     </w:pPr>
   </w:style>
-  <w:style w:type="paragraph" w:styleId="194">
+  <w:style w:type="paragraph" w:styleId="884">
     <w:name w:val="toc 6"/>
-    <w:basedOn w:val="138"/>
-    <w:next w:val="138"/>
+    <w:basedOn w:val="828"/>
+    <w:next w:val="828"/>
     <w:uiPriority w:val="39"/>
     <w:unhideWhenUsed/>
     <w:pPr>
@@ -30983,10 +31012,10 @@
       <w:ind w:left="1100"/>
     </w:pPr>
   </w:style>
-  <w:style w:type="paragraph" w:styleId="195">
+  <w:style w:type="paragraph" w:styleId="885">
     <w:name w:val="toc 7"/>
-    <w:basedOn w:val="138"/>
-    <w:next w:val="138"/>
+    <w:basedOn w:val="828"/>
+    <w:next w:val="828"/>
     <w:uiPriority w:val="39"/>
     <w:unhideWhenUsed/>
     <w:pPr>
@@ -30995,10 +31024,10 @@
       <w:ind w:left="1320"/>
     </w:pPr>
   </w:style>
-  <w:style w:type="paragraph" w:styleId="196">
+  <w:style w:type="paragraph" w:styleId="886">
     <w:name w:val="toc 8"/>
-    <w:basedOn w:val="138"/>
-    <w:next w:val="138"/>
+    <w:basedOn w:val="828"/>
+    <w:next w:val="828"/>
     <w:uiPriority w:val="39"/>
     <w:unhideWhenUsed/>
     <w:pPr>
@@ -31007,10 +31036,10 @@
       <w:ind w:left="1540"/>
     </w:pPr>
   </w:style>
-  <w:style w:type="paragraph" w:styleId="197">
+  <w:style w:type="paragraph" w:styleId="887">
     <w:name w:val="toc 9"/>
-    <w:basedOn w:val="138"/>
-    <w:next w:val="138"/>
+    <w:basedOn w:val="828"/>
+    <w:next w:val="828"/>
     <w:uiPriority w:val="39"/>
     <w:unhideWhenUsed/>
     <w:pPr>
@@ -31019,9 +31048,9 @@
       <w:ind w:left="1760"/>
     </w:pPr>
   </w:style>
-  <w:style w:type="character" w:styleId="198">
+  <w:style w:type="character" w:styleId="888">
     <w:name w:val="Placeholder Text"/>
-    <w:basedOn w:val="148"/>
+    <w:basedOn w:val="838"/>
     <w:uiPriority w:val="99"/>
     <w:semiHidden/>
     <w:pPr>
@@ -31033,7 +31062,7 @@
       <w:color w:val="666666"/>
     </w:rPr>
   </w:style>
-  <w:style w:type="paragraph" w:styleId="208">
+  <w:style w:type="paragraph" w:styleId="889">
     <w:name w:val="TOC Heading"/>
     <w:uiPriority w:val="39"/>
     <w:unhideWhenUsed/>
@@ -31043,10 +31072,10 @@
       <w:ind/>
     </w:pPr>
   </w:style>
-  <w:style w:type="paragraph" w:styleId="209">
+  <w:style w:type="paragraph" w:styleId="890">
     <w:name w:val="table of figures"/>
-    <w:basedOn w:val="138"/>
-    <w:next w:val="138"/>
+    <w:basedOn w:val="828"/>
+    <w:next w:val="828"/>
     <w:uiPriority w:val="99"/>
     <w:unhideWhenUsed/>
     <w:pPr>

</xml_diff>